<commit_message>
Templates da Revista da ANPEGE - abril26
</commit_message>
<xml_diff>
--- a/RevANPEGE_Template_carta_apres_Abril26.docx
+++ b/RevANPEGE_Template_carta_apres_Abril26.docx
@@ -61,12 +61,96 @@
           <w:szCs w:val="20"/>
           <w:highlight w:val="yellow"/>
         </w:rPr>
-        <w:t>Preencha em negrito todos os espaços grifados em amarelo e, depois, apague o grifo. O envio deste documento deve ser feito no formato pdf na plataforma da revista.</w:t>
-      </w:r>
-    </w:p>
-    <w:p>
-      <w:pPr>
-        <w:spacing w:after="0" w:line="240" w:lineRule="auto"/>
+        <w:t>Preencha em negrito todos os espaços grifados em amarelo e, depois, apague o grifo. O envio deste documento deve ser feito no formato pdf na plataforma da revista</w:t>
+      </w:r>
+      <w:r>
+        <w:rPr>
+          <w:rFonts w:ascii="Times New Roman" w:eastAsia="Times New Roman" w:hAnsi="Times New Roman" w:cs="Times New Roman"/>
+          <w:b/>
+          <w:bCs/>
+          <w:i/>
+          <w:iCs/>
+          <w:color w:val="FF0000"/>
+          <w:sz w:val="20"/>
+          <w:szCs w:val="20"/>
+          <w:highlight w:val="yellow"/>
+        </w:rPr>
+        <w:t>.</w:t>
+      </w:r>
+      <w:r>
+        <w:rPr>
+          <w:rFonts w:ascii="Times New Roman" w:eastAsia="Times New Roman" w:hAnsi="Times New Roman" w:cs="Times New Roman"/>
+          <w:b/>
+          <w:bCs/>
+          <w:i/>
+          <w:iCs/>
+          <w:color w:val="FF0000"/>
+          <w:sz w:val="20"/>
+          <w:szCs w:val="20"/>
+          <w:highlight w:val="yellow"/>
+        </w:rPr>
+        <w:t xml:space="preserve"> </w:t>
+      </w:r>
+      <w:r>
+        <w:rPr>
+          <w:rFonts w:ascii="Times New Roman" w:eastAsia="Times New Roman" w:hAnsi="Times New Roman" w:cs="Times New Roman"/>
+          <w:b/>
+          <w:bCs/>
+          <w:i/>
+          <w:iCs/>
+          <w:color w:val="FF0000"/>
+          <w:sz w:val="20"/>
+          <w:szCs w:val="20"/>
+          <w:highlight w:val="yellow"/>
+        </w:rPr>
+        <w:t>Lembre-se de que t</w:t>
+      </w:r>
+      <w:r>
+        <w:rPr>
+          <w:rFonts w:ascii="Times New Roman" w:eastAsia="Times New Roman" w:hAnsi="Times New Roman" w:cs="Times New Roman"/>
+          <w:b/>
+          <w:bCs/>
+          <w:i/>
+          <w:iCs/>
+          <w:color w:val="FF0000"/>
+          <w:sz w:val="20"/>
+          <w:szCs w:val="20"/>
+          <w:highlight w:val="yellow"/>
+        </w:rPr>
+        <w:t xml:space="preserve">odos os itens são </w:t>
+      </w:r>
+      <w:r>
+        <w:rPr>
+          <w:rFonts w:ascii="Times New Roman" w:eastAsia="Times New Roman" w:hAnsi="Times New Roman" w:cs="Times New Roman"/>
+          <w:b/>
+          <w:bCs/>
+          <w:i/>
+          <w:iCs/>
+          <w:color w:val="FF0000"/>
+          <w:sz w:val="20"/>
+          <w:szCs w:val="20"/>
+          <w:highlight w:val="yellow"/>
+        </w:rPr>
+        <w:t>obrigatórios</w:t>
+      </w:r>
+      <w:r>
+        <w:rPr>
+          <w:rFonts w:ascii="Times New Roman" w:eastAsia="Times New Roman" w:hAnsi="Times New Roman" w:cs="Times New Roman"/>
+          <w:b/>
+          <w:bCs/>
+          <w:i/>
+          <w:iCs/>
+          <w:color w:val="FF0000"/>
+          <w:sz w:val="20"/>
+          <w:szCs w:val="20"/>
+          <w:highlight w:val="yellow"/>
+        </w:rPr>
+        <w:t>.</w:t>
+      </w:r>
+    </w:p>
+    <w:p>
+      <w:pPr>
+        <w:spacing w:before="120" w:after="0" w:line="240" w:lineRule="auto"/>
         <w:jc w:val="both"/>
         <w:rPr>
           <w:rFonts w:ascii="Times New Roman" w:eastAsia="Times New Roman" w:hAnsi="Times New Roman" w:cs="Times New Roman"/>
@@ -81,212 +165,246 @@
     </w:p>
     <w:p>
       <w:pPr>
-        <w:spacing w:after="0" w:line="240" w:lineRule="auto"/>
-        <w:ind w:firstLine="851"/>
+        <w:spacing w:before="120" w:after="0" w:line="240" w:lineRule="auto"/>
+        <w:ind w:firstLine="709"/>
         <w:jc w:val="both"/>
         <w:rPr>
           <w:rFonts w:ascii="Times New Roman" w:eastAsia="Times New Roman" w:hAnsi="Times New Roman" w:cs="Times New Roman"/>
         </w:rPr>
       </w:pPr>
-    </w:p>
-    <w:p>
-      <w:pPr>
-        <w:spacing w:after="0" w:line="240" w:lineRule="auto"/>
-        <w:ind w:firstLine="851"/>
+      <w:r>
+        <w:rPr>
+          <w:rFonts w:ascii="Times New Roman" w:eastAsia="Times New Roman" w:hAnsi="Times New Roman" w:cs="Times New Roman"/>
+        </w:rPr>
+        <w:t xml:space="preserve">Eu </w:t>
+      </w:r>
+      <w:r>
+        <w:rPr>
+          <w:rFonts w:ascii="Times New Roman" w:eastAsia="Times New Roman" w:hAnsi="Times New Roman" w:cs="Times New Roman"/>
+          <w:highlight w:val="yellow"/>
+        </w:rPr>
+        <w:t>[</w:t>
+      </w:r>
+      <w:r>
+        <w:rPr>
+          <w:rFonts w:ascii="Times New Roman" w:eastAsia="Times New Roman" w:hAnsi="Times New Roman" w:cs="Times New Roman"/>
+          <w:i/>
+          <w:iCs/>
+          <w:highlight w:val="yellow"/>
+        </w:rPr>
+        <w:t>escreva seu nome aqui</w:t>
+      </w:r>
+      <w:r>
+        <w:rPr>
+          <w:rFonts w:ascii="Times New Roman" w:eastAsia="Times New Roman" w:hAnsi="Times New Roman" w:cs="Times New Roman"/>
+          <w:highlight w:val="yellow"/>
+        </w:rPr>
+        <w:t>]</w:t>
+      </w:r>
+      <w:r>
+        <w:rPr>
+          <w:rFonts w:ascii="Times New Roman" w:eastAsia="Times New Roman" w:hAnsi="Times New Roman" w:cs="Times New Roman"/>
+        </w:rPr>
+        <w:t>, na qualidade de</w:t>
+      </w:r>
+      <w:r>
+        <w:rPr>
+          <w:rFonts w:ascii="Times New Roman" w:eastAsia="Times New Roman" w:hAnsi="Times New Roman" w:cs="Times New Roman"/>
+        </w:rPr>
+        <w:t xml:space="preserve"> pessoa autora </w:t>
+      </w:r>
+      <w:r>
+        <w:rPr>
+          <w:rFonts w:ascii="Times New Roman" w:eastAsia="Times New Roman" w:hAnsi="Times New Roman" w:cs="Times New Roman"/>
+        </w:rPr>
+        <w:t xml:space="preserve">correspondente do manuscrito intitulado </w:t>
+      </w:r>
+      <w:r>
+        <w:rPr>
+          <w:rFonts w:ascii="Times New Roman" w:eastAsia="Times New Roman" w:hAnsi="Times New Roman" w:cs="Times New Roman"/>
+          <w:highlight w:val="yellow"/>
+        </w:rPr>
+        <w:t>[</w:t>
+      </w:r>
+      <w:r>
+        <w:rPr>
+          <w:rFonts w:ascii="Times New Roman" w:eastAsia="Times New Roman" w:hAnsi="Times New Roman" w:cs="Times New Roman"/>
+          <w:i/>
+          <w:iCs/>
+          <w:highlight w:val="yellow"/>
+        </w:rPr>
+        <w:t xml:space="preserve">escreva o título do </w:t>
+      </w:r>
+      <w:r>
+        <w:rPr>
+          <w:rFonts w:ascii="Times New Roman" w:eastAsia="Times New Roman" w:hAnsi="Times New Roman" w:cs="Times New Roman"/>
+          <w:i/>
+          <w:iCs/>
+          <w:highlight w:val="yellow"/>
+        </w:rPr>
+        <w:t>manuscrito</w:t>
+      </w:r>
+      <w:r>
+        <w:rPr>
+          <w:rFonts w:ascii="Times New Roman" w:eastAsia="Times New Roman" w:hAnsi="Times New Roman" w:cs="Times New Roman"/>
+          <w:i/>
+          <w:iCs/>
+          <w:highlight w:val="yellow"/>
+        </w:rPr>
+        <w:t xml:space="preserve"> aqui</w:t>
+      </w:r>
+      <w:r>
+        <w:rPr>
+          <w:rFonts w:ascii="Times New Roman" w:eastAsia="Times New Roman" w:hAnsi="Times New Roman" w:cs="Times New Roman"/>
+          <w:highlight w:val="yellow"/>
+        </w:rPr>
+        <w:t>]</w:t>
+      </w:r>
+      <w:r>
+        <w:rPr>
+          <w:rFonts w:ascii="Times New Roman" w:eastAsia="Times New Roman" w:hAnsi="Times New Roman" w:cs="Times New Roman"/>
+        </w:rPr>
+        <w:t xml:space="preserve">, da categoria </w:t>
+      </w:r>
+      <w:r>
+        <w:rPr>
+          <w:rFonts w:ascii="Times New Roman" w:eastAsia="Times New Roman" w:hAnsi="Times New Roman" w:cs="Times New Roman"/>
+          <w:highlight w:val="yellow"/>
+        </w:rPr>
+        <w:t>[</w:t>
+      </w:r>
+      <w:r>
+        <w:rPr>
+          <w:rFonts w:ascii="Times New Roman" w:eastAsia="Times New Roman" w:hAnsi="Times New Roman" w:cs="Times New Roman"/>
+          <w:i/>
+          <w:iCs/>
+          <w:highlight w:val="yellow"/>
+        </w:rPr>
+        <w:t>escolha uma modalidade: artigo de pesquisa, nota técnica, resenha etc.</w:t>
+      </w:r>
+      <w:r>
+        <w:rPr>
+          <w:rFonts w:ascii="Times New Roman" w:eastAsia="Times New Roman" w:hAnsi="Times New Roman" w:cs="Times New Roman"/>
+          <w:highlight w:val="yellow"/>
+        </w:rPr>
+        <w:t>]</w:t>
+      </w:r>
+      <w:r>
+        <w:rPr>
+          <w:rFonts w:ascii="Times New Roman" w:eastAsia="Times New Roman" w:hAnsi="Times New Roman" w:cs="Times New Roman"/>
+        </w:rPr>
+        <w:t xml:space="preserve">, </w:t>
+      </w:r>
+      <w:r>
+        <w:rPr>
+          <w:rFonts w:ascii="Times New Roman" w:eastAsia="Times New Roman" w:hAnsi="Times New Roman" w:cs="Times New Roman"/>
+        </w:rPr>
+        <w:t>venho submeter o manuscrito à avaliação da Revista da ANPEGE</w:t>
+      </w:r>
+      <w:r>
+        <w:rPr>
+          <w:rFonts w:ascii="Times New Roman" w:eastAsia="Times New Roman" w:hAnsi="Times New Roman" w:cs="Times New Roman"/>
+        </w:rPr>
+        <w:t xml:space="preserve">. Declaro que </w:t>
+      </w:r>
+      <w:r>
+        <w:rPr>
+          <w:rFonts w:ascii="Times New Roman" w:eastAsia="Times New Roman" w:hAnsi="Times New Roman" w:cs="Times New Roman"/>
+        </w:rPr>
+        <w:t xml:space="preserve">as demais pessoas autoras </w:t>
+      </w:r>
+      <w:r>
+        <w:rPr>
+          <w:rFonts w:ascii="Times New Roman" w:eastAsia="Times New Roman" w:hAnsi="Times New Roman" w:cs="Times New Roman"/>
+        </w:rPr>
+        <w:t>[</w:t>
+      </w:r>
+      <w:r>
+        <w:rPr>
+          <w:rFonts w:ascii="Times New Roman" w:eastAsia="Times New Roman" w:hAnsi="Times New Roman" w:cs="Times New Roman"/>
+          <w:i/>
+          <w:iCs/>
+          <w:highlight w:val="yellow"/>
+        </w:rPr>
+        <w:t xml:space="preserve">escreva o nome completo dos demais autores e o e-mail; e.g. </w:t>
+      </w:r>
+      <w:r>
+        <w:rPr>
+          <w:rFonts w:ascii="Times New Roman" w:eastAsia="Times New Roman" w:hAnsi="Times New Roman" w:cs="Times New Roman"/>
+          <w:i/>
+          <w:iCs/>
+          <w:highlight w:val="yellow"/>
+        </w:rPr>
+        <w:t>Fulana de Tal</w:t>
+      </w:r>
+      <w:r>
+        <w:rPr>
+          <w:rFonts w:ascii="Times New Roman" w:eastAsia="Times New Roman" w:hAnsi="Times New Roman" w:cs="Times New Roman"/>
+          <w:i/>
+          <w:iCs/>
+          <w:highlight w:val="yellow"/>
+        </w:rPr>
+        <w:t xml:space="preserve"> &lt;</w:t>
+      </w:r>
+      <w:r>
+        <w:rPr>
+          <w:rFonts w:ascii="Times New Roman" w:eastAsia="Times New Roman" w:hAnsi="Times New Roman" w:cs="Times New Roman"/>
+          <w:i/>
+          <w:iCs/>
+          <w:highlight w:val="yellow"/>
+        </w:rPr>
+        <w:t>fulanadetal</w:t>
+      </w:r>
+      <w:r>
+        <w:rPr>
+          <w:rFonts w:ascii="Times New Roman" w:eastAsia="Times New Roman" w:hAnsi="Times New Roman" w:cs="Times New Roman"/>
+          <w:i/>
+          <w:iCs/>
+          <w:highlight w:val="yellow"/>
+        </w:rPr>
+        <w:t>@uf</w:t>
+      </w:r>
+      <w:r>
+        <w:rPr>
+          <w:rFonts w:ascii="Times New Roman" w:eastAsia="Times New Roman" w:hAnsi="Times New Roman" w:cs="Times New Roman"/>
+          <w:i/>
+          <w:iCs/>
+          <w:highlight w:val="yellow"/>
+        </w:rPr>
+        <w:t>tal</w:t>
+      </w:r>
+      <w:r>
+        <w:rPr>
+          <w:rFonts w:ascii="Times New Roman" w:eastAsia="Times New Roman" w:hAnsi="Times New Roman" w:cs="Times New Roman"/>
+          <w:i/>
+          <w:iCs/>
+          <w:highlight w:val="yellow"/>
+        </w:rPr>
+        <w:t>.br&gt;</w:t>
+      </w:r>
+      <w:r>
+        <w:rPr>
+          <w:rFonts w:ascii="Times New Roman" w:eastAsia="Times New Roman" w:hAnsi="Times New Roman" w:cs="Times New Roman"/>
+          <w:highlight w:val="yellow"/>
+        </w:rPr>
+        <w:t>]</w:t>
+      </w:r>
+      <w:r>
+        <w:rPr>
+          <w:rFonts w:ascii="Times New Roman" w:eastAsia="Times New Roman" w:hAnsi="Times New Roman" w:cs="Times New Roman"/>
+        </w:rPr>
+        <w:t xml:space="preserve"> estão cientes e concordam com a submissão à Revista da ANPEGE.</w:t>
+      </w:r>
+    </w:p>
+    <w:p>
+      <w:pPr>
+        <w:spacing w:before="120" w:after="0" w:line="240" w:lineRule="auto"/>
+        <w:ind w:firstLine="709"/>
         <w:jc w:val="both"/>
         <w:rPr>
           <w:rFonts w:ascii="Times New Roman" w:eastAsia="Times New Roman" w:hAnsi="Times New Roman" w:cs="Times New Roman"/>
-        </w:rPr>
-      </w:pPr>
-      <w:r>
-        <w:rPr>
-          <w:rFonts w:ascii="Times New Roman" w:eastAsia="Times New Roman" w:hAnsi="Times New Roman" w:cs="Times New Roman"/>
-        </w:rPr>
-        <w:t>Eu [</w:t>
-      </w:r>
-      <w:r>
-        <w:rPr>
-          <w:rFonts w:ascii="Times New Roman" w:eastAsia="Times New Roman" w:hAnsi="Times New Roman" w:cs="Times New Roman"/>
-          <w:i/>
-          <w:iCs/>
-          <w:highlight w:val="yellow"/>
-        </w:rPr>
-        <w:t>escreva seu nome aqui</w:t>
-      </w:r>
-      <w:r>
-        <w:rPr>
-          <w:rFonts w:ascii="Times New Roman" w:eastAsia="Times New Roman" w:hAnsi="Times New Roman" w:cs="Times New Roman"/>
-        </w:rPr>
-        <w:t>], na qualidade de autor</w:t>
-      </w:r>
-      <w:r>
-        <w:rPr>
-          <w:rFonts w:ascii="Times New Roman" w:eastAsia="Times New Roman" w:hAnsi="Times New Roman" w:cs="Times New Roman"/>
-        </w:rPr>
-        <w:t>(a)</w:t>
-      </w:r>
-      <w:r>
-        <w:rPr>
-          <w:rFonts w:ascii="Times New Roman" w:eastAsia="Times New Roman" w:hAnsi="Times New Roman" w:cs="Times New Roman"/>
-        </w:rPr>
-        <w:t xml:space="preserve"> correspondente do manuscrito intitulado [</w:t>
-      </w:r>
-      <w:r>
-        <w:rPr>
-          <w:rFonts w:ascii="Times New Roman" w:eastAsia="Times New Roman" w:hAnsi="Times New Roman" w:cs="Times New Roman"/>
-          <w:i/>
-          <w:iCs/>
-          <w:highlight w:val="yellow"/>
-        </w:rPr>
-        <w:t xml:space="preserve">escreva o título do </w:t>
-      </w:r>
-      <w:r>
-        <w:rPr>
-          <w:rFonts w:ascii="Times New Roman" w:eastAsia="Times New Roman" w:hAnsi="Times New Roman" w:cs="Times New Roman"/>
-          <w:i/>
-          <w:iCs/>
-          <w:highlight w:val="yellow"/>
-        </w:rPr>
-        <w:t>manuscrito</w:t>
-      </w:r>
-      <w:r>
-        <w:rPr>
-          <w:rFonts w:ascii="Times New Roman" w:eastAsia="Times New Roman" w:hAnsi="Times New Roman" w:cs="Times New Roman"/>
-          <w:i/>
-          <w:iCs/>
-          <w:highlight w:val="yellow"/>
-        </w:rPr>
-        <w:t xml:space="preserve"> aqui</w:t>
-      </w:r>
-      <w:r>
-        <w:rPr>
-          <w:rFonts w:ascii="Times New Roman" w:eastAsia="Times New Roman" w:hAnsi="Times New Roman" w:cs="Times New Roman"/>
-        </w:rPr>
-        <w:t>], da categoria [</w:t>
-      </w:r>
-      <w:r>
-        <w:rPr>
-          <w:rFonts w:ascii="Times New Roman" w:eastAsia="Times New Roman" w:hAnsi="Times New Roman" w:cs="Times New Roman"/>
-          <w:i/>
-          <w:iCs/>
-          <w:highlight w:val="yellow"/>
-        </w:rPr>
-        <w:t>escolha uma modalidade: artigo de pesquisa, nota técnica, resenha etc.</w:t>
-      </w:r>
-      <w:r>
-        <w:rPr>
-          <w:rFonts w:ascii="Times New Roman" w:eastAsia="Times New Roman" w:hAnsi="Times New Roman" w:cs="Times New Roman"/>
-        </w:rPr>
-        <w:t>], venho submeter este documento à avaliação da Revista da ANPEGE. Declaro que os</w:t>
-      </w:r>
-      <w:r>
-        <w:rPr>
-          <w:rFonts w:ascii="Times New Roman" w:eastAsia="Times New Roman" w:hAnsi="Times New Roman" w:cs="Times New Roman"/>
-        </w:rPr>
-        <w:t>(as)</w:t>
-      </w:r>
-      <w:r>
-        <w:rPr>
-          <w:rFonts w:ascii="Times New Roman" w:eastAsia="Times New Roman" w:hAnsi="Times New Roman" w:cs="Times New Roman"/>
-        </w:rPr>
-        <w:t xml:space="preserve"> autores</w:t>
-      </w:r>
-      <w:r>
-        <w:rPr>
-          <w:rFonts w:ascii="Times New Roman" w:eastAsia="Times New Roman" w:hAnsi="Times New Roman" w:cs="Times New Roman"/>
-        </w:rPr>
-        <w:t>(as)</w:t>
-      </w:r>
-      <w:r>
-        <w:rPr>
-          <w:rFonts w:ascii="Times New Roman" w:eastAsia="Times New Roman" w:hAnsi="Times New Roman" w:cs="Times New Roman"/>
-        </w:rPr>
-        <w:t xml:space="preserve"> [</w:t>
-      </w:r>
-      <w:r>
-        <w:rPr>
-          <w:rFonts w:ascii="Times New Roman" w:eastAsia="Times New Roman" w:hAnsi="Times New Roman" w:cs="Times New Roman"/>
-          <w:i/>
-          <w:iCs/>
-          <w:highlight w:val="yellow"/>
-        </w:rPr>
-        <w:t xml:space="preserve">escreva o nome completo dos demais autores e o e-mail; e.g. </w:t>
-      </w:r>
-      <w:r>
-        <w:rPr>
-          <w:rFonts w:ascii="Times New Roman" w:eastAsia="Times New Roman" w:hAnsi="Times New Roman" w:cs="Times New Roman"/>
-          <w:i/>
-          <w:iCs/>
-          <w:highlight w:val="yellow"/>
-        </w:rPr>
-        <w:t>Fulana de Tal</w:t>
-      </w:r>
-      <w:r>
-        <w:rPr>
-          <w:rFonts w:ascii="Times New Roman" w:eastAsia="Times New Roman" w:hAnsi="Times New Roman" w:cs="Times New Roman"/>
-          <w:i/>
-          <w:iCs/>
-          <w:highlight w:val="yellow"/>
-        </w:rPr>
-        <w:t xml:space="preserve"> &lt;</w:t>
-      </w:r>
-      <w:r>
-        <w:rPr>
-          <w:rFonts w:ascii="Times New Roman" w:eastAsia="Times New Roman" w:hAnsi="Times New Roman" w:cs="Times New Roman"/>
-          <w:i/>
-          <w:iCs/>
-          <w:highlight w:val="yellow"/>
-        </w:rPr>
-        <w:t>fulanadetal</w:t>
-      </w:r>
-      <w:r>
-        <w:rPr>
-          <w:rFonts w:ascii="Times New Roman" w:eastAsia="Times New Roman" w:hAnsi="Times New Roman" w:cs="Times New Roman"/>
-          <w:i/>
-          <w:iCs/>
-          <w:highlight w:val="yellow"/>
-        </w:rPr>
-        <w:t>@uf</w:t>
-      </w:r>
-      <w:r>
-        <w:rPr>
-          <w:rFonts w:ascii="Times New Roman" w:eastAsia="Times New Roman" w:hAnsi="Times New Roman" w:cs="Times New Roman"/>
-          <w:i/>
-          <w:iCs/>
-          <w:highlight w:val="yellow"/>
-        </w:rPr>
-        <w:t>tal</w:t>
-      </w:r>
-      <w:r>
-        <w:rPr>
-          <w:rFonts w:ascii="Times New Roman" w:eastAsia="Times New Roman" w:hAnsi="Times New Roman" w:cs="Times New Roman"/>
-          <w:i/>
-          <w:iCs/>
-          <w:highlight w:val="yellow"/>
-        </w:rPr>
-        <w:t>.br&gt;</w:t>
-      </w:r>
-      <w:r>
-        <w:rPr>
-          <w:rFonts w:ascii="Times New Roman" w:eastAsia="Times New Roman" w:hAnsi="Times New Roman" w:cs="Times New Roman"/>
-          <w:highlight w:val="yellow"/>
-        </w:rPr>
-        <w:t>]</w:t>
-      </w:r>
-      <w:r>
-        <w:rPr>
-          <w:rFonts w:ascii="Times New Roman" w:eastAsia="Times New Roman" w:hAnsi="Times New Roman" w:cs="Times New Roman"/>
-        </w:rPr>
-        <w:t xml:space="preserve"> estão cientes e concordam com a submissão à Revista da ANPEGE.</w:t>
-      </w:r>
-    </w:p>
-    <w:p>
-      <w:pPr>
-        <w:spacing w:before="240" w:after="0" w:line="240" w:lineRule="auto"/>
-        <w:ind w:firstLine="851"/>
-        <w:jc w:val="both"/>
-        <w:rPr>
-          <w:rFonts w:ascii="Times New Roman" w:eastAsia="Times New Roman" w:hAnsi="Times New Roman" w:cs="Times New Roman"/>
+          <w:i/>
+          <w:iCs/>
         </w:rPr>
       </w:pPr>
       <w:r>
@@ -319,7 +437,88 @@
           <w:iCs/>
           <w:highlight w:val="yellow"/>
         </w:rPr>
-        <w:t>nome completo, link do Lattes, formação, titulação acadêmica, atividade que exerce, instituição de vínculo e e-mail</w:t>
+        <w:t xml:space="preserve">nome completo, </w:t>
+      </w:r>
+      <w:r>
+        <w:rPr>
+          <w:rFonts w:ascii="Times New Roman" w:eastAsia="Times New Roman" w:hAnsi="Times New Roman" w:cs="Times New Roman"/>
+          <w:i/>
+          <w:iCs/>
+          <w:highlight w:val="yellow"/>
+        </w:rPr>
+        <w:t>maior titulação</w:t>
+      </w:r>
+      <w:r>
+        <w:rPr>
+          <w:rFonts w:ascii="Times New Roman" w:eastAsia="Times New Roman" w:hAnsi="Times New Roman" w:cs="Times New Roman"/>
+          <w:i/>
+          <w:iCs/>
+          <w:highlight w:val="yellow"/>
+        </w:rPr>
+        <w:t xml:space="preserve"> e área; </w:t>
+      </w:r>
+      <w:r>
+        <w:rPr>
+          <w:rFonts w:ascii="Times New Roman" w:eastAsia="Times New Roman" w:hAnsi="Times New Roman" w:cs="Times New Roman"/>
+          <w:i/>
+          <w:iCs/>
+          <w:highlight w:val="yellow"/>
+        </w:rPr>
+        <w:t>instituição de vínculo;</w:t>
+      </w:r>
+      <w:r>
+        <w:rPr>
+          <w:rFonts w:ascii="Times New Roman" w:eastAsia="Times New Roman" w:hAnsi="Times New Roman" w:cs="Times New Roman"/>
+          <w:i/>
+          <w:iCs/>
+          <w:highlight w:val="yellow"/>
+        </w:rPr>
+        <w:t xml:space="preserve"> </w:t>
+      </w:r>
+      <w:r>
+        <w:rPr>
+          <w:rFonts w:ascii="Times New Roman" w:eastAsia="Times New Roman" w:hAnsi="Times New Roman" w:cs="Times New Roman"/>
+          <w:i/>
+          <w:iCs/>
+          <w:highlight w:val="yellow"/>
+        </w:rPr>
+        <w:t>ORCID;</w:t>
+      </w:r>
+      <w:r>
+        <w:rPr>
+          <w:rFonts w:ascii="Times New Roman" w:eastAsia="Times New Roman" w:hAnsi="Times New Roman" w:cs="Times New Roman"/>
+          <w:i/>
+          <w:iCs/>
+          <w:highlight w:val="yellow"/>
+        </w:rPr>
+        <w:t xml:space="preserve"> </w:t>
+      </w:r>
+      <w:r>
+        <w:rPr>
+          <w:rFonts w:ascii="Times New Roman" w:eastAsia="Times New Roman" w:hAnsi="Times New Roman" w:cs="Times New Roman"/>
+          <w:i/>
+          <w:iCs/>
+          <w:highlight w:val="yellow"/>
+        </w:rPr>
+        <w:t>Lattes;</w:t>
+      </w:r>
+      <w:r>
+        <w:rPr>
+          <w:rFonts w:ascii="Times New Roman" w:eastAsia="Times New Roman" w:hAnsi="Times New Roman" w:cs="Times New Roman"/>
+          <w:i/>
+          <w:iCs/>
+          <w:highlight w:val="yellow"/>
+        </w:rPr>
+        <w:t xml:space="preserve"> </w:t>
+      </w:r>
+      <w:r>
+        <w:rPr>
+          <w:rFonts w:ascii="Times New Roman" w:eastAsia="Times New Roman" w:hAnsi="Times New Roman" w:cs="Times New Roman"/>
+          <w:i/>
+          <w:iCs/>
+          <w:highlight w:val="yellow"/>
+        </w:rPr>
+        <w:t>e e-mail</w:t>
       </w:r>
       <w:r>
         <w:rPr>
@@ -335,98 +534,536 @@
         <w:pStyle w:val="PargrafodaLista"/>
         <w:numPr>
           <w:ilvl w:val="0"/>
-          <w:numId w:val="3"/>
+          <w:numId w:val="5"/>
         </w:numPr>
+        <w:spacing w:before="120" w:after="0" w:line="240" w:lineRule="auto"/>
+        <w:jc w:val="both"/>
+        <w:rPr>
+          <w:rFonts w:ascii="Times New Roman" w:eastAsia="Times New Roman" w:hAnsi="Times New Roman" w:cs="Times New Roman"/>
+          <w:highlight w:val="yellow"/>
+        </w:rPr>
+      </w:pPr>
+      <w:r>
+        <w:rPr>
+          <w:rFonts w:ascii="Times New Roman" w:eastAsia="Times New Roman" w:hAnsi="Times New Roman" w:cs="Times New Roman"/>
+          <w:highlight w:val="yellow"/>
+        </w:rPr>
+        <w:t>[</w:t>
+      </w:r>
+      <w:r>
+        <w:rPr>
+          <w:rFonts w:ascii="Times New Roman" w:eastAsia="Times New Roman" w:hAnsi="Times New Roman" w:cs="Times New Roman"/>
+          <w:highlight w:val="yellow"/>
+        </w:rPr>
+        <w:t>Pessoa autora 1</w:t>
+      </w:r>
+      <w:r>
+        <w:rPr>
+          <w:rFonts w:ascii="Times New Roman" w:eastAsia="Times New Roman" w:hAnsi="Times New Roman" w:cs="Times New Roman"/>
+          <w:highlight w:val="yellow"/>
+        </w:rPr>
+        <w:t xml:space="preserve"> </w:t>
+      </w:r>
+      <w:r>
+        <w:rPr>
+          <w:rFonts w:ascii="Times New Roman" w:eastAsia="Times New Roman" w:hAnsi="Times New Roman" w:cs="Times New Roman"/>
+          <w:highlight w:val="yellow"/>
+        </w:rPr>
+        <w:t xml:space="preserve">– </w:t>
+      </w:r>
+      <w:r>
+        <w:rPr>
+          <w:rFonts w:ascii="Times New Roman" w:eastAsia="Times New Roman" w:hAnsi="Times New Roman" w:cs="Times New Roman"/>
+          <w:i/>
+          <w:iCs/>
+          <w:highlight w:val="yellow"/>
+        </w:rPr>
+        <w:t>nome completo, maior titulação e área; instituição de vínculo; ORCID; Lattes; e e-mail</w:t>
+      </w:r>
+      <w:r>
+        <w:rPr>
+          <w:rFonts w:ascii="Times New Roman" w:eastAsia="Times New Roman" w:hAnsi="Times New Roman" w:cs="Times New Roman"/>
+          <w:highlight w:val="yellow"/>
+        </w:rPr>
+        <w:t xml:space="preserve"> (apresentar essas informações a todos os autores)</w:t>
+      </w:r>
+      <w:r>
+        <w:rPr>
+          <w:rFonts w:ascii="Times New Roman" w:eastAsia="Times New Roman" w:hAnsi="Times New Roman" w:cs="Times New Roman"/>
+          <w:highlight w:val="yellow"/>
+        </w:rPr>
+        <w:t>]</w:t>
+      </w:r>
+      <w:r>
+        <w:rPr>
+          <w:rFonts w:ascii="Times New Roman" w:eastAsia="Times New Roman" w:hAnsi="Times New Roman" w:cs="Times New Roman"/>
+          <w:highlight w:val="yellow"/>
+        </w:rPr>
+        <w:t>.</w:t>
+      </w:r>
+    </w:p>
+    <w:p>
+      <w:pPr>
+        <w:spacing w:before="120" w:after="0" w:line="240" w:lineRule="auto"/>
+        <w:ind w:firstLine="709"/>
+        <w:jc w:val="both"/>
+        <w:rPr>
+          <w:rFonts w:ascii="Times New Roman" w:eastAsia="Times New Roman" w:hAnsi="Times New Roman" w:cs="Times New Roman"/>
+        </w:rPr>
+      </w:pPr>
+      <w:r>
+        <w:rPr>
+          <w:rFonts w:ascii="Times New Roman" w:eastAsia="Times New Roman" w:hAnsi="Times New Roman" w:cs="Times New Roman"/>
+        </w:rPr>
+        <w:t>As principais contribuições do manuscrito para a área são:</w:t>
+      </w:r>
+      <w:r>
+        <w:rPr>
+          <w:rFonts w:ascii="Times New Roman" w:eastAsia="Times New Roman" w:hAnsi="Times New Roman" w:cs="Times New Roman"/>
+        </w:rPr>
+        <w:t xml:space="preserve"> </w:t>
+      </w:r>
+      <w:r>
+        <w:rPr>
+          <w:rFonts w:ascii="Times New Roman" w:eastAsia="Times New Roman" w:hAnsi="Times New Roman" w:cs="Times New Roman"/>
+          <w:highlight w:val="yellow"/>
+        </w:rPr>
+        <w:t>[</w:t>
+      </w:r>
+      <w:r>
+        <w:rPr>
+          <w:rFonts w:ascii="Times New Roman" w:eastAsia="Times New Roman" w:hAnsi="Times New Roman" w:cs="Times New Roman"/>
+          <w:i/>
+          <w:iCs/>
+          <w:highlight w:val="yellow"/>
+        </w:rPr>
+        <w:t xml:space="preserve">descreva aqui as contribuições apresentadas no </w:t>
+      </w:r>
+      <w:r>
+        <w:rPr>
+          <w:rFonts w:ascii="Times New Roman" w:eastAsia="Times New Roman" w:hAnsi="Times New Roman" w:cs="Times New Roman"/>
+          <w:i/>
+          <w:iCs/>
+          <w:highlight w:val="yellow"/>
+        </w:rPr>
+        <w:t>manuscrito</w:t>
+      </w:r>
+      <w:r>
+        <w:rPr>
+          <w:rFonts w:ascii="Times New Roman" w:eastAsia="Times New Roman" w:hAnsi="Times New Roman" w:cs="Times New Roman"/>
+          <w:i/>
+          <w:iCs/>
+          <w:highlight w:val="yellow"/>
+        </w:rPr>
+        <w:t xml:space="preserve"> à comunidade acadêmica da Revista da ANPEGE. Utilize, no máximo, 5 linhas</w:t>
+      </w:r>
+      <w:r>
+        <w:rPr>
+          <w:rFonts w:ascii="Times New Roman" w:eastAsia="Times New Roman" w:hAnsi="Times New Roman" w:cs="Times New Roman"/>
+          <w:highlight w:val="yellow"/>
+        </w:rPr>
+        <w:t>]</w:t>
+      </w:r>
+      <w:r>
+        <w:rPr>
+          <w:rFonts w:ascii="Times New Roman" w:eastAsia="Times New Roman" w:hAnsi="Times New Roman" w:cs="Times New Roman"/>
+        </w:rPr>
+        <w:t>.</w:t>
+      </w:r>
+    </w:p>
+    <w:p>
+      <w:pPr>
+        <w:spacing w:before="120" w:after="0" w:line="240" w:lineRule="auto"/>
+        <w:ind w:firstLine="709"/>
+        <w:jc w:val="both"/>
+        <w:rPr>
+          <w:rFonts w:ascii="Times New Roman" w:eastAsia="Times New Roman" w:hAnsi="Times New Roman" w:cs="Times New Roman"/>
+        </w:rPr>
+      </w:pPr>
+      <w:r>
+        <w:rPr>
+          <w:rFonts w:ascii="Times New Roman" w:eastAsia="Times New Roman" w:hAnsi="Times New Roman" w:cs="Times New Roman"/>
+        </w:rPr>
+        <w:t>Origem acadêmica e circulação prévia do manuscrito:</w:t>
+      </w:r>
+    </w:p>
+    <w:p>
+      <w:pPr>
         <w:spacing w:after="0" w:line="240" w:lineRule="auto"/>
+        <w:ind w:left="709"/>
+        <w:rPr>
+          <w:rFonts w:ascii="Times New Roman" w:eastAsia="Times New Roman" w:hAnsi="Times New Roman" w:cs="Times New Roman"/>
+          <w:lang w:val="pt-US"/>
+        </w:rPr>
+      </w:pPr>
+      <w:r>
+        <w:rPr>
+          <w:rFonts w:ascii="Times New Roman" w:eastAsia="Times New Roman" w:hAnsi="Times New Roman" w:cs="Times New Roman"/>
+          <w:lang w:val="pt-US"/>
+        </w:rPr>
+        <w:t xml:space="preserve">( ) O manuscrito não foi apresentado previamente em evento acadêmico, nem deriva de trabalho de conclusão de curso, </w:t>
+      </w:r>
+      <w:r>
+        <w:rPr>
+          <w:rFonts w:ascii="Times New Roman" w:eastAsia="Times New Roman" w:hAnsi="Times New Roman" w:cs="Times New Roman"/>
+          <w:lang w:val="pt-US"/>
+        </w:rPr>
+        <w:t xml:space="preserve">de </w:t>
+      </w:r>
+      <w:r>
+        <w:rPr>
+          <w:rFonts w:ascii="Times New Roman" w:eastAsia="Times New Roman" w:hAnsi="Times New Roman" w:cs="Times New Roman"/>
+          <w:lang w:val="pt-US"/>
+        </w:rPr>
+        <w:t xml:space="preserve">dissertação, </w:t>
+      </w:r>
+      <w:r>
+        <w:rPr>
+          <w:rFonts w:ascii="Times New Roman" w:eastAsia="Times New Roman" w:hAnsi="Times New Roman" w:cs="Times New Roman"/>
+          <w:lang w:val="pt-US"/>
+        </w:rPr>
+        <w:t xml:space="preserve">de </w:t>
+      </w:r>
+      <w:r>
+        <w:rPr>
+          <w:rFonts w:ascii="Times New Roman" w:eastAsia="Times New Roman" w:hAnsi="Times New Roman" w:cs="Times New Roman"/>
+          <w:lang w:val="pt-US"/>
+        </w:rPr>
+        <w:t>tese ou</w:t>
+      </w:r>
+      <w:r>
+        <w:rPr>
+          <w:rFonts w:ascii="Times New Roman" w:eastAsia="Times New Roman" w:hAnsi="Times New Roman" w:cs="Times New Roman"/>
+          <w:lang w:val="pt-US"/>
+        </w:rPr>
+        <w:t xml:space="preserve"> de</w:t>
+      </w:r>
+      <w:r>
+        <w:rPr>
+          <w:rFonts w:ascii="Times New Roman" w:eastAsia="Times New Roman" w:hAnsi="Times New Roman" w:cs="Times New Roman"/>
+          <w:lang w:val="pt-US"/>
+        </w:rPr>
+        <w:t xml:space="preserve"> outro trabalho acadêmico.</w:t>
+      </w:r>
+    </w:p>
+    <w:p>
+      <w:pPr>
+        <w:spacing w:after="0" w:line="240" w:lineRule="auto"/>
+        <w:ind w:left="709"/>
+        <w:rPr>
+          <w:rFonts w:ascii="Times New Roman" w:eastAsia="Times New Roman" w:hAnsi="Times New Roman" w:cs="Times New Roman"/>
+          <w:lang w:val="pt-US"/>
+        </w:rPr>
+      </w:pPr>
+      <w:r>
+        <w:rPr>
+          <w:rFonts w:ascii="Times New Roman" w:eastAsia="Times New Roman" w:hAnsi="Times New Roman" w:cs="Times New Roman"/>
+          <w:lang w:val="pt-US"/>
+        </w:rPr>
+        <w:t>( ) O manuscrito foi apresentado previamente em evento acadêmico.</w:t>
+      </w:r>
+      <w:r>
+        <w:rPr>
+          <w:rFonts w:ascii="Times New Roman" w:eastAsia="Times New Roman" w:hAnsi="Times New Roman" w:cs="Times New Roman"/>
+          <w:lang w:val="pt-US"/>
+        </w:rPr>
+        <w:t xml:space="preserve"> </w:t>
+      </w:r>
+      <w:r>
+        <w:rPr>
+          <w:rFonts w:ascii="Times New Roman" w:eastAsia="Times New Roman" w:hAnsi="Times New Roman" w:cs="Times New Roman"/>
+          <w:highlight w:val="yellow"/>
+        </w:rPr>
+        <w:t>[</w:t>
+      </w:r>
+      <w:r>
+        <w:rPr>
+          <w:rFonts w:ascii="Times New Roman" w:eastAsia="Times New Roman" w:hAnsi="Times New Roman" w:cs="Times New Roman"/>
+          <w:i/>
+          <w:iCs/>
+          <w:highlight w:val="yellow"/>
+        </w:rPr>
+        <w:t>Informar</w:t>
+      </w:r>
+      <w:r>
+        <w:rPr>
+          <w:rFonts w:ascii="Times New Roman" w:eastAsia="Times New Roman" w:hAnsi="Times New Roman" w:cs="Times New Roman"/>
+          <w:i/>
+          <w:iCs/>
+          <w:highlight w:val="yellow"/>
+        </w:rPr>
+        <w:t xml:space="preserve"> </w:t>
+      </w:r>
+      <w:r>
+        <w:rPr>
+          <w:rFonts w:ascii="Times New Roman" w:eastAsia="Times New Roman" w:hAnsi="Times New Roman" w:cs="Times New Roman"/>
+          <w:i/>
+          <w:iCs/>
+          <w:highlight w:val="yellow"/>
+        </w:rPr>
+        <w:t>o nome do evento, a instituição promotora, o local, a data, o título apresentado e a</w:t>
+      </w:r>
+      <w:r>
+        <w:rPr>
+          <w:rFonts w:ascii="Times New Roman" w:eastAsia="Times New Roman" w:hAnsi="Times New Roman" w:cs="Times New Roman"/>
+          <w:i/>
+          <w:iCs/>
+          <w:highlight w:val="yellow"/>
+        </w:rPr>
+        <w:t xml:space="preserve"> forma de circulação do trabalho (resumo </w:t>
+      </w:r>
+      <w:r>
+        <w:rPr>
+          <w:rFonts w:ascii="Times New Roman" w:eastAsia="Times New Roman" w:hAnsi="Times New Roman" w:cs="Times New Roman"/>
+          <w:i/>
+          <w:iCs/>
+          <w:highlight w:val="yellow"/>
+        </w:rPr>
+        <w:t>simples, resumo expandido, trabalho completo em anais etc</w:t>
+      </w:r>
+      <w:r>
+        <w:rPr>
+          <w:rFonts w:ascii="Times New Roman" w:eastAsia="Times New Roman" w:hAnsi="Times New Roman" w:cs="Times New Roman"/>
+          <w:i/>
+          <w:iCs/>
+          <w:highlight w:val="yellow"/>
+        </w:rPr>
+        <w:t>.</w:t>
+      </w:r>
+      <w:r>
+        <w:rPr>
+          <w:rFonts w:ascii="Times New Roman" w:eastAsia="Times New Roman" w:hAnsi="Times New Roman" w:cs="Times New Roman"/>
+          <w:i/>
+          <w:iCs/>
+          <w:highlight w:val="yellow"/>
+        </w:rPr>
+        <w:t>)</w:t>
+      </w:r>
+      <w:r>
+        <w:rPr>
+          <w:rFonts w:ascii="Times New Roman" w:eastAsia="Times New Roman" w:hAnsi="Times New Roman" w:cs="Times New Roman"/>
+          <w:highlight w:val="yellow"/>
+        </w:rPr>
+        <w:t>]</w:t>
+      </w:r>
+      <w:r>
+        <w:rPr>
+          <w:rFonts w:ascii="Times New Roman" w:eastAsia="Times New Roman" w:hAnsi="Times New Roman" w:cs="Times New Roman"/>
+        </w:rPr>
+        <w:t>.</w:t>
+      </w:r>
+    </w:p>
+    <w:p>
+      <w:pPr>
+        <w:spacing w:after="0" w:line="240" w:lineRule="auto"/>
+        <w:ind w:left="709"/>
+        <w:rPr>
+          <w:rFonts w:ascii="Times New Roman" w:eastAsia="Times New Roman" w:hAnsi="Times New Roman" w:cs="Times New Roman"/>
+          <w:lang w:val="pt-US"/>
+        </w:rPr>
+      </w:pPr>
+      <w:r>
+        <w:rPr>
+          <w:rFonts w:ascii="Times New Roman" w:eastAsia="Times New Roman" w:hAnsi="Times New Roman" w:cs="Times New Roman"/>
+          <w:lang w:val="pt-US"/>
+        </w:rPr>
+        <w:t xml:space="preserve">( ) O manuscrito deriva de </w:t>
+      </w:r>
+      <w:r>
+        <w:rPr>
+          <w:rFonts w:ascii="Times New Roman" w:eastAsia="Times New Roman" w:hAnsi="Times New Roman" w:cs="Times New Roman"/>
+          <w:lang w:val="pt-US"/>
+        </w:rPr>
+        <w:t xml:space="preserve">um </w:t>
+      </w:r>
+      <w:r>
+        <w:rPr>
+          <w:rFonts w:ascii="Times New Roman" w:eastAsia="Times New Roman" w:hAnsi="Times New Roman" w:cs="Times New Roman"/>
+          <w:lang w:val="pt-US"/>
+        </w:rPr>
+        <w:t>trabalho de conclusão de curso, monografia, dissertação ou tese</w:t>
+      </w:r>
+      <w:r>
+        <w:rPr>
+          <w:rFonts w:ascii="Times New Roman" w:eastAsia="Times New Roman" w:hAnsi="Times New Roman" w:cs="Times New Roman"/>
+          <w:lang w:val="pt-US"/>
+        </w:rPr>
+        <w:t>.</w:t>
+      </w:r>
+      <w:r>
+        <w:rPr>
+          <w:rFonts w:ascii="Times New Roman" w:eastAsia="Times New Roman" w:hAnsi="Times New Roman" w:cs="Times New Roman"/>
+        </w:rPr>
+        <w:t xml:space="preserve"> </w:t>
+      </w:r>
+      <w:r>
+        <w:rPr>
+          <w:rFonts w:ascii="Times New Roman" w:eastAsia="Times New Roman" w:hAnsi="Times New Roman" w:cs="Times New Roman"/>
+          <w:highlight w:val="yellow"/>
+        </w:rPr>
+        <w:t>[</w:t>
+      </w:r>
+      <w:r>
+        <w:rPr>
+          <w:rFonts w:ascii="Times New Roman" w:eastAsia="Times New Roman" w:hAnsi="Times New Roman" w:cs="Times New Roman"/>
+          <w:i/>
+          <w:iCs/>
+          <w:highlight w:val="yellow"/>
+        </w:rPr>
+        <w:t>Informar: tipo de trabalho, título, autor(a), instituição, programa/curso, ano</w:t>
+      </w:r>
+      <w:r>
+        <w:rPr>
+          <w:rFonts w:ascii="Times New Roman" w:eastAsia="Times New Roman" w:hAnsi="Times New Roman" w:cs="Times New Roman"/>
+          <w:i/>
+          <w:iCs/>
+          <w:highlight w:val="yellow"/>
+        </w:rPr>
+        <w:t xml:space="preserve"> (ou em desenvolvimento, se for o caso)</w:t>
+      </w:r>
+      <w:r>
+        <w:rPr>
+          <w:rFonts w:ascii="Times New Roman" w:eastAsia="Times New Roman" w:hAnsi="Times New Roman" w:cs="Times New Roman"/>
+          <w:i/>
+          <w:iCs/>
+          <w:highlight w:val="yellow"/>
+        </w:rPr>
+        <w:t xml:space="preserve"> e link do repositório, quando houver</w:t>
+      </w:r>
+      <w:r>
+        <w:rPr>
+          <w:rFonts w:ascii="Times New Roman" w:eastAsia="Times New Roman" w:hAnsi="Times New Roman" w:cs="Times New Roman"/>
+          <w:highlight w:val="yellow"/>
+        </w:rPr>
+        <w:t>]</w:t>
+      </w:r>
+      <w:r>
+        <w:rPr>
+          <w:rFonts w:ascii="Times New Roman" w:eastAsia="Times New Roman" w:hAnsi="Times New Roman" w:cs="Times New Roman"/>
+        </w:rPr>
+        <w:t>.</w:t>
+      </w:r>
+    </w:p>
+    <w:p>
+      <w:pPr>
+        <w:spacing w:after="0" w:line="240" w:lineRule="auto"/>
+        <w:ind w:left="709"/>
+        <w:rPr>
+          <w:rFonts w:ascii="Times New Roman" w:eastAsia="Times New Roman" w:hAnsi="Times New Roman" w:cs="Times New Roman"/>
+          <w:lang w:val="pt-US"/>
+        </w:rPr>
+      </w:pPr>
+      <w:r>
+        <w:rPr>
+          <w:rFonts w:ascii="Times New Roman" w:eastAsia="Times New Roman" w:hAnsi="Times New Roman" w:cs="Times New Roman"/>
+          <w:lang w:val="pt-US"/>
+        </w:rPr>
+        <w:t>( ) O manuscrito deriva de outra produção acadêmica ou técnica.</w:t>
+      </w:r>
+      <w:r>
+        <w:rPr>
+          <w:rFonts w:ascii="Times New Roman" w:eastAsia="Times New Roman" w:hAnsi="Times New Roman" w:cs="Times New Roman"/>
+        </w:rPr>
+        <w:t xml:space="preserve"> </w:t>
+      </w:r>
+      <w:r>
+        <w:rPr>
+          <w:rFonts w:ascii="Times New Roman" w:eastAsia="Times New Roman" w:hAnsi="Times New Roman" w:cs="Times New Roman"/>
+          <w:highlight w:val="yellow"/>
+        </w:rPr>
+        <w:t>[</w:t>
+      </w:r>
+      <w:r>
+        <w:rPr>
+          <w:rFonts w:ascii="Times New Roman" w:eastAsia="Times New Roman" w:hAnsi="Times New Roman" w:cs="Times New Roman"/>
+          <w:i/>
+          <w:iCs/>
+          <w:highlight w:val="yellow"/>
+        </w:rPr>
+        <w:t>I</w:t>
+      </w:r>
+      <w:r>
+        <w:rPr>
+          <w:rFonts w:ascii="Times New Roman" w:eastAsia="Times New Roman" w:hAnsi="Times New Roman" w:cs="Times New Roman"/>
+          <w:i/>
+          <w:iCs/>
+          <w:highlight w:val="yellow"/>
+        </w:rPr>
+        <w:t>nformar detalhadamente qual</w:t>
+      </w:r>
+      <w:r>
+        <w:rPr>
+          <w:rFonts w:ascii="Times New Roman" w:eastAsia="Times New Roman" w:hAnsi="Times New Roman" w:cs="Times New Roman"/>
+          <w:highlight w:val="yellow"/>
+        </w:rPr>
+        <w:t>]</w:t>
+      </w:r>
+      <w:r>
+        <w:rPr>
+          <w:rFonts w:ascii="Times New Roman" w:eastAsia="Times New Roman" w:hAnsi="Times New Roman" w:cs="Times New Roman"/>
+        </w:rPr>
+        <w:t>.</w:t>
+      </w:r>
+    </w:p>
+    <w:p>
+      <w:pPr>
+        <w:spacing w:before="120" w:after="0" w:line="240" w:lineRule="auto"/>
+        <w:ind w:firstLine="709"/>
         <w:jc w:val="both"/>
         <w:rPr>
           <w:rFonts w:ascii="Times New Roman" w:eastAsia="Times New Roman" w:hAnsi="Times New Roman" w:cs="Times New Roman"/>
-        </w:rPr>
-      </w:pPr>
-      <w:r>
-        <w:rPr>
-          <w:rFonts w:ascii="Times New Roman" w:eastAsia="Times New Roman" w:hAnsi="Times New Roman" w:cs="Times New Roman"/>
-          <w:highlight w:val="yellow"/>
-        </w:rPr>
-        <w:t xml:space="preserve">Autor(a) 1 – </w:t>
-      </w:r>
-      <w:r>
-        <w:rPr>
-          <w:rFonts w:ascii="Times New Roman" w:eastAsia="Times New Roman" w:hAnsi="Times New Roman" w:cs="Times New Roman"/>
-          <w:i/>
-          <w:iCs/>
-          <w:highlight w:val="yellow"/>
-        </w:rPr>
-        <w:t>nome completo, link do Lattes, formação, titulação acadêmica, atividade que exerce, instituição de vínculo e e-mail</w:t>
-      </w:r>
-      <w:r>
-        <w:rPr>
-          <w:rFonts w:ascii="Times New Roman" w:eastAsia="Times New Roman" w:hAnsi="Times New Roman" w:cs="Times New Roman"/>
-          <w:highlight w:val="yellow"/>
-        </w:rPr>
-        <w:t>. (apresentar essas informações a todos os autores)</w:t>
-      </w:r>
-      <w:r>
-        <w:rPr>
-          <w:rFonts w:ascii="Times New Roman" w:eastAsia="Times New Roman" w:hAnsi="Times New Roman" w:cs="Times New Roman"/>
-        </w:rPr>
-        <w:t>.</w:t>
-      </w:r>
-    </w:p>
-    <w:p>
-      <w:pPr>
-        <w:spacing w:before="240" w:after="0" w:line="240" w:lineRule="auto"/>
-        <w:ind w:firstLine="851"/>
-        <w:jc w:val="both"/>
-        <w:rPr>
-          <w:rFonts w:ascii="Times New Roman" w:eastAsia="Times New Roman" w:hAnsi="Times New Roman" w:cs="Times New Roman"/>
-        </w:rPr>
-      </w:pPr>
-      <w:r>
-        <w:rPr>
-          <w:rFonts w:ascii="Times New Roman" w:eastAsia="Times New Roman" w:hAnsi="Times New Roman" w:cs="Times New Roman"/>
-        </w:rPr>
-        <w:t>As principais contribuições deste trabalho são atribuídas [</w:t>
-      </w:r>
-      <w:r>
-        <w:rPr>
-          <w:rFonts w:ascii="Times New Roman" w:eastAsia="Times New Roman" w:hAnsi="Times New Roman" w:cs="Times New Roman"/>
-          <w:i/>
-          <w:iCs/>
-          <w:highlight w:val="yellow"/>
-        </w:rPr>
-        <w:t>descreva aqui as contribuições apresentadas no artigo à comunidade acadêmica da Revista da ANPEGE. Utilize, no máximo, 5 linhas</w:t>
-      </w:r>
-      <w:r>
-        <w:rPr>
-          <w:rFonts w:ascii="Times New Roman" w:eastAsia="Times New Roman" w:hAnsi="Times New Roman" w:cs="Times New Roman"/>
-          <w:highlight w:val="yellow"/>
-        </w:rPr>
-        <w:t>]</w:t>
-      </w:r>
-      <w:r>
-        <w:rPr>
-          <w:rFonts w:ascii="Times New Roman" w:eastAsia="Times New Roman" w:hAnsi="Times New Roman" w:cs="Times New Roman"/>
-        </w:rPr>
-        <w:t>.</w:t>
-      </w:r>
-    </w:p>
-    <w:p>
-      <w:pPr>
-        <w:spacing w:before="240" w:after="0" w:line="240" w:lineRule="auto"/>
-        <w:ind w:firstLine="851"/>
-        <w:jc w:val="both"/>
-        <w:rPr>
-          <w:rFonts w:ascii="Times New Roman" w:eastAsia="Times New Roman" w:hAnsi="Times New Roman" w:cs="Times New Roman"/>
-          <w:i/>
-          <w:iCs/>
-        </w:rPr>
-      </w:pPr>
-      <w:r>
-        <w:rPr>
-          <w:rFonts w:ascii="Times New Roman" w:eastAsia="Times New Roman" w:hAnsi="Times New Roman" w:cs="Times New Roman"/>
-        </w:rPr>
-        <w:t>Dada a competência na área do estudo, indico(amos) o nome dos seguintes 3 (três) pesquisadores que podem atuar como revisores do manuscrito, e declaro não haver qualquer conflito de interesse para esta indicação: [</w:t>
+          <w:i/>
+          <w:iCs/>
+        </w:rPr>
+      </w:pPr>
+      <w:r>
+        <w:rPr>
+          <w:rFonts w:ascii="Times New Roman" w:eastAsia="Times New Roman" w:hAnsi="Times New Roman" w:cs="Times New Roman"/>
+        </w:rPr>
+        <w:t>Considerando a aderência temática e a expertise na área do manuscrito, indicamos os três nomes a seguir como sugestões de pareceristas</w:t>
+      </w:r>
+      <w:r>
+        <w:rPr>
+          <w:rFonts w:ascii="Times New Roman" w:eastAsia="Times New Roman" w:hAnsi="Times New Roman" w:cs="Times New Roman"/>
+        </w:rPr>
+        <w:t xml:space="preserve"> </w:t>
+      </w:r>
+      <w:r>
+        <w:rPr>
+          <w:rFonts w:ascii="Times New Roman" w:eastAsia="Times New Roman" w:hAnsi="Times New Roman" w:cs="Times New Roman"/>
+        </w:rPr>
+        <w:t>e declaramos que não há conflito de interesse</w:t>
+      </w:r>
+      <w:r>
+        <w:rPr>
+          <w:rFonts w:ascii="Times New Roman" w:eastAsia="Times New Roman" w:hAnsi="Times New Roman" w:cs="Times New Roman"/>
+        </w:rPr>
+        <w:t>s</w:t>
+      </w:r>
+      <w:r>
+        <w:rPr>
+          <w:rFonts w:ascii="Times New Roman" w:eastAsia="Times New Roman" w:hAnsi="Times New Roman" w:cs="Times New Roman"/>
+        </w:rPr>
+        <w:t xml:space="preserve"> entre as pessoas autoras e os nomes indicados</w:t>
+      </w:r>
+      <w:r>
+        <w:rPr>
+          <w:rFonts w:ascii="Times New Roman" w:eastAsia="Times New Roman" w:hAnsi="Times New Roman" w:cs="Times New Roman"/>
+        </w:rPr>
+        <w:t>, nos termos das instruções de submissão da revista</w:t>
+      </w:r>
+      <w:r>
+        <w:rPr>
+          <w:rFonts w:ascii="Times New Roman" w:eastAsia="Times New Roman" w:hAnsi="Times New Roman" w:cs="Times New Roman"/>
+        </w:rPr>
+        <w:t xml:space="preserve">: </w:t>
+      </w:r>
+      <w:r>
+        <w:rPr>
+          <w:rFonts w:ascii="Times New Roman" w:eastAsia="Times New Roman" w:hAnsi="Times New Roman" w:cs="Times New Roman"/>
+          <w:highlight w:val="yellow"/>
+        </w:rPr>
+        <w:t>[</w:t>
       </w:r>
       <w:r>
         <w:rPr>
@@ -446,24 +1083,38 @@
           <w:iCs/>
           <w:highlight w:val="yellow"/>
         </w:rPr>
-        <w:t>Atente-se à experiência dos revisores indicados em publicações, à diversidade de gênero e à diversidade regional (no Brasil e no exterior, quando possível), bem como a possíveis conflitos de interesse.</w:t>
-      </w:r>
-      <w:r>
-        <w:rPr>
-          <w:rFonts w:ascii="Times New Roman" w:eastAsia="Times New Roman" w:hAnsi="Times New Roman" w:cs="Times New Roman"/>
-          <w:i/>
-          <w:iCs/>
-          <w:highlight w:val="yellow"/>
-        </w:rPr>
-        <w:t xml:space="preserve"> As indicações não serão escolha obrigatória do comitê editorial.</w:t>
-      </w:r>
-      <w:r>
-        <w:rPr>
-          <w:rFonts w:ascii="Times New Roman" w:eastAsia="Times New Roman" w:hAnsi="Times New Roman" w:cs="Times New Roman"/>
-          <w:i/>
-          <w:iCs/>
-        </w:rPr>
-        <w:t>]</w:t>
+        <w:t>Atente-se à experiência dos revisores indicados em publicações, à diversidade de gênero e à diversidade regional (no Brasil e no exterior, quando possível), bem como a possíveis conflitos de interesse</w:t>
+      </w:r>
+      <w:r>
+        <w:rPr>
+          <w:rFonts w:ascii="Times New Roman" w:eastAsia="Times New Roman" w:hAnsi="Times New Roman" w:cs="Times New Roman"/>
+          <w:b/>
+          <w:bCs/>
+          <w:i/>
+          <w:iCs/>
+          <w:highlight w:val="yellow"/>
+        </w:rPr>
+        <w:t>, conforme especificados na Portaria CNPq 2.664/2026</w:t>
+      </w:r>
+      <w:r>
+        <w:rPr>
+          <w:rFonts w:ascii="Times New Roman" w:eastAsia="Times New Roman" w:hAnsi="Times New Roman" w:cs="Times New Roman"/>
+          <w:b/>
+          <w:bCs/>
+          <w:i/>
+          <w:iCs/>
+          <w:highlight w:val="yellow"/>
+        </w:rPr>
+        <w:t>.</w:t>
+      </w:r>
+      <w:r>
+        <w:rPr>
+          <w:rFonts w:ascii="Times New Roman" w:eastAsia="Times New Roman" w:hAnsi="Times New Roman" w:cs="Times New Roman"/>
+          <w:i/>
+          <w:iCs/>
+          <w:highlight w:val="yellow"/>
+        </w:rPr>
+        <w:t xml:space="preserve"> As indicações não serão escolha obrigatória do comitê editorial.]</w:t>
       </w:r>
     </w:p>
     <w:p>
@@ -472,7 +1123,11 @@
           <w:ilvl w:val="0"/>
           <w:numId w:val="1"/>
         </w:numPr>
+        <w:tabs>
+          <w:tab w:val="left" w:pos="993"/>
+        </w:tabs>
         <w:spacing w:after="0" w:line="240" w:lineRule="auto"/>
+        <w:ind w:left="709" w:firstLine="0"/>
         <w:jc w:val="both"/>
         <w:rPr>
           <w:rFonts w:ascii="Times New Roman" w:eastAsia="Times New Roman" w:hAnsi="Times New Roman" w:cs="Times New Roman"/>
@@ -497,7 +1152,11 @@
           <w:ilvl w:val="0"/>
           <w:numId w:val="1"/>
         </w:numPr>
+        <w:tabs>
+          <w:tab w:val="left" w:pos="993"/>
+        </w:tabs>
         <w:spacing w:after="0" w:line="240" w:lineRule="auto"/>
+        <w:ind w:left="709" w:firstLine="0"/>
         <w:jc w:val="both"/>
         <w:rPr>
           <w:rFonts w:ascii="Times New Roman" w:eastAsia="Times New Roman" w:hAnsi="Times New Roman" w:cs="Times New Roman"/>
@@ -522,7 +1181,11 @@
           <w:ilvl w:val="0"/>
           <w:numId w:val="1"/>
         </w:numPr>
+        <w:tabs>
+          <w:tab w:val="left" w:pos="993"/>
+        </w:tabs>
         <w:spacing w:after="0" w:line="240" w:lineRule="auto"/>
+        <w:ind w:left="709" w:firstLine="0"/>
         <w:jc w:val="both"/>
         <w:rPr>
           <w:rFonts w:ascii="Times New Roman" w:eastAsia="Times New Roman" w:hAnsi="Times New Roman" w:cs="Times New Roman"/>
@@ -543,11 +1206,9 @@
     </w:p>
     <w:p>
       <w:pPr>
-        <w:spacing w:before="240" w:after="0" w:line="240" w:lineRule="auto"/>
+        <w:spacing w:before="120" w:after="0" w:line="240" w:lineRule="auto"/>
+        <w:ind w:firstLine="709"/>
         <w:jc w:val="both"/>
-        <w:rPr>
-          <w:rFonts w:ascii="Times New Roman" w:eastAsia="Times New Roman" w:hAnsi="Times New Roman" w:cs="Times New Roman"/>
-        </w:rPr>
       </w:pPr>
       <w:r>
         <w:rPr>
@@ -562,6 +1223,9 @@
           <w:rFonts w:ascii="Times New Roman" w:eastAsia="Times New Roman" w:hAnsi="Times New Roman" w:cs="Times New Roman"/>
         </w:rPr>
         <w:t>Ao submeter este manuscrito à Revista da ANPEGE, declaro, em nome de todas as pessoas autoras, que:</w:t>
+      </w:r>
+      <w:r>
+        <w:t xml:space="preserve"> </w:t>
       </w:r>
     </w:p>
     <w:p>
@@ -571,7 +1235,11 @@
           <w:ilvl w:val="0"/>
           <w:numId w:val="4"/>
         </w:numPr>
+        <w:tabs>
+          <w:tab w:val="left" w:pos="993"/>
+        </w:tabs>
         <w:spacing w:after="0" w:line="240" w:lineRule="auto"/>
+        <w:ind w:left="709" w:firstLine="0"/>
         <w:jc w:val="both"/>
         <w:rPr>
           <w:rFonts w:ascii="Times New Roman" w:eastAsia="Times New Roman" w:hAnsi="Times New Roman" w:cs="Times New Roman"/>
@@ -581,13 +1249,13 @@
         <w:rPr>
           <w:rFonts w:ascii="Times New Roman" w:eastAsia="Times New Roman" w:hAnsi="Times New Roman" w:cs="Times New Roman"/>
         </w:rPr>
-        <w:t>O</w:t>
-      </w:r>
-      <w:r>
-        <w:rPr>
-          <w:rFonts w:ascii="Times New Roman" w:eastAsia="Times New Roman" w:hAnsi="Times New Roman" w:cs="Times New Roman"/>
-        </w:rPr>
-        <w:t xml:space="preserve"> manuscrito é original, inédito nos termos da política editorial da revista e não está em avaliação simultânea por outro periódico ou meio de divulgação;</w:t>
+        <w:t>O manuscrito é original e atende ao requisito de ineditismo nos termos da política editorial da revista, consideradas as informações prestadas nesta carta sobre apresentação prévia em evento e eventual derivação de trabalho acadêmico</w:t>
+      </w:r>
+      <w:r>
+        <w:rPr>
+          <w:rFonts w:ascii="Times New Roman" w:eastAsia="Times New Roman" w:hAnsi="Times New Roman" w:cs="Times New Roman"/>
+        </w:rPr>
+        <w:t>;</w:t>
       </w:r>
     </w:p>
     <w:p>
@@ -597,7 +1265,11 @@
           <w:ilvl w:val="0"/>
           <w:numId w:val="4"/>
         </w:numPr>
+        <w:tabs>
+          <w:tab w:val="left" w:pos="993"/>
+        </w:tabs>
         <w:spacing w:after="0" w:line="240" w:lineRule="auto"/>
+        <w:ind w:left="709" w:firstLine="0"/>
         <w:jc w:val="both"/>
         <w:rPr>
           <w:rFonts w:ascii="Times New Roman" w:eastAsia="Times New Roman" w:hAnsi="Times New Roman" w:cs="Times New Roman"/>
@@ -623,7 +1295,11 @@
           <w:ilvl w:val="0"/>
           <w:numId w:val="4"/>
         </w:numPr>
+        <w:tabs>
+          <w:tab w:val="left" w:pos="993"/>
+        </w:tabs>
         <w:spacing w:after="0" w:line="240" w:lineRule="auto"/>
+        <w:ind w:left="709" w:firstLine="0"/>
         <w:jc w:val="both"/>
         <w:rPr>
           <w:rFonts w:ascii="Times New Roman" w:eastAsia="Times New Roman" w:hAnsi="Times New Roman" w:cs="Times New Roman"/>
@@ -633,13 +1309,13 @@
         <w:rPr>
           <w:rFonts w:ascii="Times New Roman" w:eastAsia="Times New Roman" w:hAnsi="Times New Roman" w:cs="Times New Roman"/>
         </w:rPr>
-        <w:t>A</w:t>
-      </w:r>
-      <w:r>
-        <w:rPr>
-          <w:rFonts w:ascii="Times New Roman" w:eastAsia="Times New Roman" w:hAnsi="Times New Roman" w:cs="Times New Roman"/>
-        </w:rPr>
-        <w:t xml:space="preserve"> submissão está em conformidade com a Política de Integridade na Atividade Científica do CNPq, instituída pela Portaria CNPq nº 2.664, de 6 de março de 2026, adotada pela Revista da ANPEGE como referência de integridade, honestidade intelectual, veracidade na autoria, responsabilidade e transparência na comunicação científica;</w:t>
+        <w:t>A submissão observa a Política de Integridade na Atividade Científica do CNPq, instituída pela Portaria CNPq nº 2.664, de 6 de março de 2026, adotada pela Revista da ANPEGE como referência para integridade, veracidade na autoria, responsabilidade e transparência na comunicação científica</w:t>
+      </w:r>
+      <w:r>
+        <w:rPr>
+          <w:rFonts w:ascii="Times New Roman" w:eastAsia="Times New Roman" w:hAnsi="Times New Roman" w:cs="Times New Roman"/>
+        </w:rPr>
+        <w:t>;</w:t>
       </w:r>
     </w:p>
     <w:p>
@@ -649,7 +1325,11 @@
           <w:ilvl w:val="0"/>
           <w:numId w:val="4"/>
         </w:numPr>
+        <w:tabs>
+          <w:tab w:val="left" w:pos="993"/>
+        </w:tabs>
         <w:spacing w:after="0" w:line="240" w:lineRule="auto"/>
+        <w:ind w:left="709" w:firstLine="0"/>
         <w:jc w:val="both"/>
         <w:rPr>
           <w:rFonts w:ascii="Times New Roman" w:eastAsia="Times New Roman" w:hAnsi="Times New Roman" w:cs="Times New Roman"/>
@@ -675,7 +1355,11 @@
           <w:ilvl w:val="0"/>
           <w:numId w:val="4"/>
         </w:numPr>
+        <w:tabs>
+          <w:tab w:val="left" w:pos="993"/>
+        </w:tabs>
         <w:spacing w:after="0" w:line="240" w:lineRule="auto"/>
+        <w:ind w:left="709" w:firstLine="0"/>
         <w:jc w:val="both"/>
         <w:rPr>
           <w:rFonts w:ascii="Times New Roman" w:eastAsia="Times New Roman" w:hAnsi="Times New Roman" w:cs="Times New Roman"/>
@@ -685,7 +1369,13 @@
         <w:rPr>
           <w:rFonts w:ascii="Times New Roman" w:eastAsia="Times New Roman" w:hAnsi="Times New Roman" w:cs="Times New Roman"/>
         </w:rPr>
-        <w:t>todas as contribuições que não configuram autoria foram devidamente reconhecidas no manuscrito;</w:t>
+        <w:t>T</w:t>
+      </w:r>
+      <w:r>
+        <w:rPr>
+          <w:rFonts w:ascii="Times New Roman" w:eastAsia="Times New Roman" w:hAnsi="Times New Roman" w:cs="Times New Roman"/>
+        </w:rPr>
+        <w:t>odas as contribuições que não configuram autoria foram devidamente reconhecidas no manuscrito;</w:t>
       </w:r>
     </w:p>
     <w:p>
@@ -695,7 +1385,11 @@
           <w:ilvl w:val="0"/>
           <w:numId w:val="4"/>
         </w:numPr>
+        <w:tabs>
+          <w:tab w:val="left" w:pos="993"/>
+        </w:tabs>
         <w:spacing w:after="0" w:line="240" w:lineRule="auto"/>
+        <w:ind w:left="709" w:firstLine="0"/>
         <w:jc w:val="both"/>
         <w:rPr>
           <w:rFonts w:ascii="Times New Roman" w:eastAsia="Times New Roman" w:hAnsi="Times New Roman" w:cs="Times New Roman"/>
@@ -705,7 +1399,13 @@
         <w:rPr>
           <w:rFonts w:ascii="Times New Roman" w:eastAsia="Times New Roman" w:hAnsi="Times New Roman" w:cs="Times New Roman"/>
         </w:rPr>
-        <w:t>eventuais vínculos, apoios institucionais, financiamentos e potenciais conflitos de interesse foram integralmente informados;</w:t>
+        <w:t>E</w:t>
+      </w:r>
+      <w:r>
+        <w:rPr>
+          <w:rFonts w:ascii="Times New Roman" w:eastAsia="Times New Roman" w:hAnsi="Times New Roman" w:cs="Times New Roman"/>
+        </w:rPr>
+        <w:t>ventuais vínculos, apoios institucionais, financiamentos e potenciais conflitos de interesse foram integralmente informados;</w:t>
       </w:r>
     </w:p>
     <w:p>
@@ -715,7 +1415,11 @@
           <w:ilvl w:val="0"/>
           <w:numId w:val="4"/>
         </w:numPr>
+        <w:tabs>
+          <w:tab w:val="left" w:pos="993"/>
+        </w:tabs>
         <w:spacing w:after="0" w:line="240" w:lineRule="auto"/>
+        <w:ind w:left="709" w:firstLine="0"/>
         <w:jc w:val="both"/>
         <w:rPr>
           <w:rFonts w:ascii="Times New Roman" w:eastAsia="Times New Roman" w:hAnsi="Times New Roman" w:cs="Times New Roman"/>
@@ -725,7 +1429,13 @@
         <w:rPr>
           <w:rFonts w:ascii="Times New Roman" w:eastAsia="Times New Roman" w:hAnsi="Times New Roman" w:cs="Times New Roman"/>
         </w:rPr>
-        <w:t>foram respeitados os princípios éticos aplicáveis à pesquisa com seres humanos e/ou animais, quando cabíveis, e os documentos comprobatórios pertinentes foram enviados como documentos suplementares;</w:t>
+        <w:t>F</w:t>
+      </w:r>
+      <w:r>
+        <w:rPr>
+          <w:rFonts w:ascii="Times New Roman" w:eastAsia="Times New Roman" w:hAnsi="Times New Roman" w:cs="Times New Roman"/>
+        </w:rPr>
+        <w:t>oram respeitados os princípios éticos aplicáveis à pesquisa com seres humanos e/ou animais, quando cabíveis, e os documentos comprobatórios pertinentes foram enviados como documentos suplementares;</w:t>
       </w:r>
     </w:p>
     <w:p>
@@ -735,7 +1445,11 @@
           <w:ilvl w:val="0"/>
           <w:numId w:val="4"/>
         </w:numPr>
+        <w:tabs>
+          <w:tab w:val="left" w:pos="993"/>
+        </w:tabs>
         <w:spacing w:after="0" w:line="240" w:lineRule="auto"/>
+        <w:ind w:left="709" w:firstLine="0"/>
         <w:jc w:val="both"/>
         <w:rPr>
           <w:rFonts w:ascii="Times New Roman" w:eastAsia="Times New Roman" w:hAnsi="Times New Roman" w:cs="Times New Roman"/>
@@ -745,7 +1459,55 @@
         <w:rPr>
           <w:rFonts w:ascii="Times New Roman" w:eastAsia="Times New Roman" w:hAnsi="Times New Roman" w:cs="Times New Roman"/>
         </w:rPr>
-        <w:t>o eventual uso de ferramentas de inteligência artificial foi realizado de modo ético, transparente e responsável, sem atribuição de autoria a sistemas de IA; quando aplicável, esse uso foi declarado nesta carta e informado no manuscrito, com identificação da ferramenta e descrição objetiva de sua finalidade;</w:t>
+        <w:t>O</w:t>
+      </w:r>
+      <w:r>
+        <w:rPr>
+          <w:rFonts w:ascii="Times New Roman" w:eastAsia="Times New Roman" w:hAnsi="Times New Roman" w:cs="Times New Roman"/>
+        </w:rPr>
+        <w:t xml:space="preserve"> eventual uso de ferramentas de inteligência artificial foi realizado de modo ético, transparente e responsável, sem atribuição de autoria a sistemas de IA</w:t>
+      </w:r>
+      <w:r>
+        <w:rPr>
+          <w:rFonts w:ascii="Times New Roman" w:eastAsia="Times New Roman" w:hAnsi="Times New Roman" w:cs="Times New Roman"/>
+        </w:rPr>
+        <w:t xml:space="preserve">. Caso </w:t>
+      </w:r>
+      <w:r>
+        <w:rPr>
+          <w:rFonts w:ascii="Times New Roman" w:eastAsia="Times New Roman" w:hAnsi="Times New Roman" w:cs="Times New Roman"/>
+        </w:rPr>
+        <w:t>esse uso t</w:t>
+      </w:r>
+      <w:r>
+        <w:rPr>
+          <w:rFonts w:ascii="Times New Roman" w:eastAsia="Times New Roman" w:hAnsi="Times New Roman" w:cs="Times New Roman"/>
+        </w:rPr>
+        <w:t>enha</w:t>
+      </w:r>
+      <w:r>
+        <w:rPr>
+          <w:rFonts w:ascii="Times New Roman" w:eastAsia="Times New Roman" w:hAnsi="Times New Roman" w:cs="Times New Roman"/>
+        </w:rPr>
+        <w:t xml:space="preserve"> sido relevante para a elaboração do manuscrito ou para a realização da pesquisa</w:t>
+      </w:r>
+      <w:r>
+        <w:rPr>
+          <w:rFonts w:ascii="Times New Roman" w:eastAsia="Times New Roman" w:hAnsi="Times New Roman" w:cs="Times New Roman"/>
+        </w:rPr>
+        <w:t xml:space="preserve">, </w:t>
+      </w:r>
+      <w:r>
+        <w:rPr>
+          <w:rFonts w:ascii="Times New Roman" w:eastAsia="Times New Roman" w:hAnsi="Times New Roman" w:cs="Times New Roman"/>
+        </w:rPr>
+        <w:t>o</w:t>
+      </w:r>
+      <w:r>
+        <w:rPr>
+          <w:rFonts w:ascii="Times New Roman" w:eastAsia="Times New Roman" w:hAnsi="Times New Roman" w:cs="Times New Roman"/>
+        </w:rPr>
+        <w:t xml:space="preserve"> uso foi declarado nesta carta e informado no manuscrito, com identificação da ferramenta e descrição objetiva de sua finalidade;</w:t>
       </w:r>
     </w:p>
     <w:p>
@@ -755,7 +1517,11 @@
           <w:ilvl w:val="0"/>
           <w:numId w:val="4"/>
         </w:numPr>
+        <w:tabs>
+          <w:tab w:val="left" w:pos="993"/>
+        </w:tabs>
         <w:spacing w:after="0" w:line="240" w:lineRule="auto"/>
+        <w:ind w:left="709" w:firstLine="0"/>
         <w:jc w:val="both"/>
         <w:rPr>
           <w:rFonts w:ascii="Times New Roman" w:eastAsia="Times New Roman" w:hAnsi="Times New Roman" w:cs="Times New Roman"/>
@@ -766,419 +1532,283 @@
         <w:rPr>
           <w:rFonts w:ascii="Times New Roman" w:eastAsia="Times New Roman" w:hAnsi="Times New Roman" w:cs="Times New Roman"/>
         </w:rPr>
-        <w:t>as pessoas autoras estão de acordo com a política editorial, a política de acesso aberto e os termos de licenciamento adotados pela Revista da ANPEGE, sob a licença Creative Commons CC BY 4.0.</w:t>
-      </w:r>
-    </w:p>
-    <w:p>
-      <w:pPr>
+        <w:lastRenderedPageBreak/>
+        <w:t>A</w:t>
+      </w:r>
+      <w:r>
+        <w:rPr>
+          <w:rFonts w:ascii="Times New Roman" w:eastAsia="Times New Roman" w:hAnsi="Times New Roman" w:cs="Times New Roman"/>
+        </w:rPr>
+        <w:t>s pessoas autoras estão de acordo com a política editorial, a política de acesso aberto e os termos de licenciamento adotados pela Revista da ANPEGE, sob a licença Creative Commons CC BY 4.0.</w:t>
+      </w:r>
+    </w:p>
+    <w:p>
+      <w:pPr>
+        <w:spacing w:before="120" w:after="0" w:line="240" w:lineRule="auto"/>
+        <w:ind w:firstLine="709"/>
+        <w:jc w:val="both"/>
+        <w:rPr>
+          <w:rFonts w:ascii="Times New Roman" w:eastAsia="Times New Roman" w:hAnsi="Times New Roman" w:cs="Times New Roman"/>
+        </w:rPr>
+      </w:pPr>
+      <w:r>
+        <w:rPr>
+          <w:rFonts w:ascii="Times New Roman" w:eastAsia="Times New Roman" w:hAnsi="Times New Roman" w:cs="Times New Roman"/>
+        </w:rPr>
+        <w:t>Uso de inteligência artificial (preenchimento obrigatório):</w:t>
+      </w:r>
+    </w:p>
+    <w:p>
+      <w:pPr>
+        <w:tabs>
+          <w:tab w:val="left" w:pos="993"/>
+          <w:tab w:val="left" w:pos="1134"/>
+        </w:tabs>
         <w:spacing w:after="0" w:line="240" w:lineRule="auto"/>
-        <w:jc w:val="both"/>
-        <w:rPr>
-          <w:rFonts w:ascii="Times New Roman" w:eastAsia="Times New Roman" w:hAnsi="Times New Roman" w:cs="Times New Roman"/>
-          <w:lang w:val="pt-US"/>
-        </w:rPr>
-      </w:pPr>
-    </w:p>
-    <w:p>
-      <w:pPr>
-        <w:numPr>
-          <w:ilvl w:val="0"/>
-          <w:numId w:val="2"/>
-        </w:numPr>
-        <w:pBdr>
-          <w:top w:val="nil"/>
-          <w:left w:val="nil"/>
-          <w:bottom w:val="nil"/>
-          <w:right w:val="nil"/>
-          <w:between w:val="nil"/>
-        </w:pBdr>
+        <w:ind w:firstLine="709"/>
+        <w:rPr>
+          <w:rFonts w:ascii="Times New Roman" w:eastAsia="Times New Roman" w:hAnsi="Times New Roman" w:cs="Times New Roman"/>
+        </w:rPr>
+      </w:pPr>
+      <w:r>
+        <w:rPr>
+          <w:rFonts w:ascii="Times New Roman" w:eastAsia="Times New Roman" w:hAnsi="Times New Roman" w:cs="Times New Roman"/>
+        </w:rPr>
+        <w:t>(</w:t>
+      </w:r>
+      <w:r>
+        <w:rPr>
+          <w:rFonts w:ascii="Times New Roman" w:eastAsia="Times New Roman" w:hAnsi="Times New Roman" w:cs="Times New Roman"/>
+        </w:rPr>
+        <w:t xml:space="preserve"> </w:t>
+      </w:r>
+      <w:r>
+        <w:rPr>
+          <w:rFonts w:ascii="Times New Roman" w:eastAsia="Times New Roman" w:hAnsi="Times New Roman" w:cs="Times New Roman"/>
+        </w:rPr>
+        <w:t xml:space="preserve">) </w:t>
+      </w:r>
+      <w:r>
+        <w:rPr>
+          <w:rFonts w:ascii="Times New Roman" w:eastAsia="Times New Roman" w:hAnsi="Times New Roman" w:cs="Times New Roman"/>
+        </w:rPr>
+        <w:t xml:space="preserve">Não houve uso relevante de ferramenta de IA na pesquisa nem na </w:t>
+      </w:r>
+      <w:r>
+        <w:rPr>
+          <w:rFonts w:ascii="Times New Roman" w:eastAsia="Times New Roman" w:hAnsi="Times New Roman" w:cs="Times New Roman"/>
+        </w:rPr>
+        <w:t>elaboração</w:t>
+      </w:r>
+      <w:r>
+        <w:rPr>
+          <w:rFonts w:ascii="Times New Roman" w:eastAsia="Times New Roman" w:hAnsi="Times New Roman" w:cs="Times New Roman"/>
+        </w:rPr>
+        <w:t xml:space="preserve"> do manuscrito.</w:t>
+      </w:r>
+    </w:p>
+    <w:p>
+      <w:pPr>
+        <w:tabs>
+          <w:tab w:val="left" w:pos="993"/>
+          <w:tab w:val="left" w:pos="1134"/>
+        </w:tabs>
         <w:spacing w:after="0" w:line="240" w:lineRule="auto"/>
-        <w:jc w:val="both"/>
-        <w:rPr>
-          <w:rFonts w:ascii="Times New Roman" w:eastAsia="Times New Roman" w:hAnsi="Times New Roman" w:cs="Times New Roman"/>
-          <w:color w:val="000000"/>
-        </w:rPr>
-      </w:pPr>
-      <w:r>
-        <w:rPr>
-          <w:rFonts w:ascii="Times New Roman" w:eastAsia="Times New Roman" w:hAnsi="Times New Roman" w:cs="Times New Roman"/>
-          <w:color w:val="000000"/>
-        </w:rPr>
-        <w:t xml:space="preserve">Certifico que o manuscrito supracitado é original e não está </w:t>
-      </w:r>
-      <w:r>
-        <w:rPr>
-          <w:rFonts w:ascii="Times New Roman" w:eastAsia="Times New Roman" w:hAnsi="Times New Roman" w:cs="Times New Roman"/>
-          <w:color w:val="000000"/>
-        </w:rPr>
-        <w:t>em</w:t>
-      </w:r>
-      <w:r>
-        <w:rPr>
-          <w:rFonts w:ascii="Times New Roman" w:eastAsia="Times New Roman" w:hAnsi="Times New Roman" w:cs="Times New Roman"/>
-          <w:color w:val="000000"/>
-        </w:rPr>
-        <w:t xml:space="preserve"> avaliação </w:t>
-      </w:r>
-      <w:r>
-        <w:rPr>
-          <w:rFonts w:ascii="Times New Roman" w:eastAsia="Times New Roman" w:hAnsi="Times New Roman" w:cs="Times New Roman"/>
-          <w:color w:val="000000"/>
-        </w:rPr>
-        <w:t>por</w:t>
-      </w:r>
-      <w:r>
-        <w:rPr>
-          <w:rFonts w:ascii="Times New Roman" w:eastAsia="Times New Roman" w:hAnsi="Times New Roman" w:cs="Times New Roman"/>
-          <w:color w:val="000000"/>
-        </w:rPr>
-        <w:t xml:space="preserve"> outro periódico </w:t>
-      </w:r>
-      <w:r>
-        <w:rPr>
-          <w:rFonts w:ascii="Times New Roman" w:eastAsia="Times New Roman" w:hAnsi="Times New Roman" w:cs="Times New Roman"/>
-          <w:color w:val="000000"/>
-        </w:rPr>
-        <w:t xml:space="preserve">acadêmico ou </w:t>
-      </w:r>
-      <w:r>
-        <w:rPr>
-          <w:rFonts w:ascii="Times New Roman" w:eastAsia="Times New Roman" w:hAnsi="Times New Roman" w:cs="Times New Roman"/>
-          <w:color w:val="000000"/>
-        </w:rPr>
-        <w:t>por</w:t>
-      </w:r>
-      <w:r>
-        <w:rPr>
-          <w:rFonts w:ascii="Times New Roman" w:eastAsia="Times New Roman" w:hAnsi="Times New Roman" w:cs="Times New Roman"/>
-          <w:color w:val="000000"/>
-        </w:rPr>
-        <w:t xml:space="preserve"> quaisquer outros meios de divulgação, quer nos formatos impressos, quer </w:t>
-      </w:r>
-      <w:r>
-        <w:rPr>
-          <w:rFonts w:ascii="Times New Roman" w:eastAsia="Times New Roman" w:hAnsi="Times New Roman" w:cs="Times New Roman"/>
-          <w:color w:val="000000"/>
-        </w:rPr>
-        <w:t xml:space="preserve">nos </w:t>
-      </w:r>
-      <w:r>
-        <w:rPr>
-          <w:rFonts w:ascii="Times New Roman" w:eastAsia="Times New Roman" w:hAnsi="Times New Roman" w:cs="Times New Roman"/>
-          <w:color w:val="000000"/>
-        </w:rPr>
-        <w:t>eletrônicos.</w:t>
-      </w:r>
-    </w:p>
-    <w:p>
-      <w:pPr>
-        <w:numPr>
-          <w:ilvl w:val="0"/>
-          <w:numId w:val="2"/>
-        </w:numPr>
-        <w:pBdr>
-          <w:top w:val="nil"/>
-          <w:left w:val="nil"/>
-          <w:bottom w:val="nil"/>
-          <w:right w:val="nil"/>
-          <w:between w:val="nil"/>
-        </w:pBdr>
+        <w:ind w:firstLine="709"/>
+        <w:rPr>
+          <w:rFonts w:ascii="Times New Roman" w:eastAsia="Times New Roman" w:hAnsi="Times New Roman" w:cs="Times New Roman"/>
+        </w:rPr>
+      </w:pPr>
+      <w:r>
+        <w:rPr>
+          <w:rFonts w:ascii="Times New Roman" w:eastAsia="Times New Roman" w:hAnsi="Times New Roman" w:cs="Times New Roman"/>
+        </w:rPr>
+        <w:t xml:space="preserve">( ) </w:t>
+      </w:r>
+      <w:r>
+        <w:rPr>
+          <w:rFonts w:ascii="Times New Roman" w:eastAsia="Times New Roman" w:hAnsi="Times New Roman" w:cs="Times New Roman"/>
+        </w:rPr>
+        <w:t>Houve uso de ferramenta(s) de IA</w:t>
+      </w:r>
+      <w:r>
+        <w:rPr>
+          <w:rFonts w:ascii="Times New Roman" w:eastAsia="Times New Roman" w:hAnsi="Times New Roman" w:cs="Times New Roman"/>
+        </w:rPr>
+        <w:t xml:space="preserve">: </w:t>
+      </w:r>
+      <w:r>
+        <w:rPr>
+          <w:rFonts w:ascii="Times New Roman" w:eastAsia="Times New Roman" w:hAnsi="Times New Roman" w:cs="Times New Roman"/>
+          <w:highlight w:val="yellow"/>
+        </w:rPr>
+        <w:t>[</w:t>
+      </w:r>
+      <w:r>
+        <w:rPr>
+          <w:rFonts w:ascii="Times New Roman" w:eastAsia="Times New Roman" w:hAnsi="Times New Roman" w:cs="Times New Roman"/>
+          <w:i/>
+          <w:iCs/>
+          <w:highlight w:val="yellow"/>
+        </w:rPr>
+        <w:t>descrever todas as ferramentas utilizadas</w:t>
+      </w:r>
+      <w:r>
+        <w:rPr>
+          <w:rFonts w:ascii="Times New Roman" w:eastAsia="Times New Roman" w:hAnsi="Times New Roman" w:cs="Times New Roman"/>
+          <w:highlight w:val="yellow"/>
+        </w:rPr>
+        <w:t>]</w:t>
+      </w:r>
+    </w:p>
+    <w:p>
+      <w:pPr>
+        <w:tabs>
+          <w:tab w:val="left" w:pos="993"/>
+          <w:tab w:val="left" w:pos="1134"/>
+        </w:tabs>
         <w:spacing w:after="0" w:line="240" w:lineRule="auto"/>
-        <w:jc w:val="both"/>
-        <w:rPr>
-          <w:rFonts w:ascii="Times New Roman" w:eastAsia="Times New Roman" w:hAnsi="Times New Roman" w:cs="Times New Roman"/>
-          <w:color w:val="000000"/>
-        </w:rPr>
-      </w:pPr>
-      <w:r>
-        <w:rPr>
-          <w:rFonts w:ascii="Times New Roman" w:eastAsia="Times New Roman" w:hAnsi="Times New Roman" w:cs="Times New Roman"/>
-          <w:color w:val="000000"/>
-        </w:rPr>
-        <w:t xml:space="preserve">Garanto que os dados relatados no </w:t>
-      </w:r>
-      <w:r>
-        <w:rPr>
-          <w:rFonts w:ascii="Times New Roman" w:eastAsia="Times New Roman" w:hAnsi="Times New Roman" w:cs="Times New Roman"/>
-          <w:color w:val="000000"/>
-        </w:rPr>
-        <w:t>manuscrito</w:t>
-      </w:r>
-      <w:r>
-        <w:rPr>
-          <w:rFonts w:ascii="Times New Roman" w:eastAsia="Times New Roman" w:hAnsi="Times New Roman" w:cs="Times New Roman"/>
-          <w:color w:val="000000"/>
-        </w:rPr>
-        <w:t xml:space="preserve"> não são resultados de má conduta, a saber: dados produzidos, uso indevido de imagens (tabelas, gráficos, quadros, figuras, escalas, desenhos, instrumentos, questionários, validação de metodologias e outros tipos de ilustrações), falsificação, plágio, autoplágio ou duplicidade, e que sou o único autor e proprietário dos direitos autorais.</w:t>
-      </w:r>
-    </w:p>
-    <w:p>
-      <w:pPr>
-        <w:numPr>
-          <w:ilvl w:val="0"/>
-          <w:numId w:val="2"/>
-        </w:numPr>
-        <w:pBdr>
-          <w:top w:val="nil"/>
-          <w:left w:val="nil"/>
-          <w:bottom w:val="nil"/>
-          <w:right w:val="nil"/>
-          <w:between w:val="nil"/>
-        </w:pBdr>
+        <w:ind w:firstLine="709"/>
+        <w:rPr>
+          <w:rFonts w:ascii="Times New Roman" w:eastAsia="Times New Roman" w:hAnsi="Times New Roman" w:cs="Times New Roman"/>
+        </w:rPr>
+      </w:pPr>
+      <w:r>
+        <w:rPr>
+          <w:rFonts w:ascii="Times New Roman" w:eastAsia="Times New Roman" w:hAnsi="Times New Roman" w:cs="Times New Roman"/>
+        </w:rPr>
+        <w:t>Descrever a finalidade</w:t>
+      </w:r>
+      <w:r>
+        <w:rPr>
+          <w:rFonts w:ascii="Times New Roman" w:eastAsia="Times New Roman" w:hAnsi="Times New Roman" w:cs="Times New Roman"/>
+        </w:rPr>
+        <w:t xml:space="preserve"> do uso: </w:t>
+      </w:r>
+      <w:r>
+        <w:rPr>
+          <w:rFonts w:ascii="Times New Roman" w:eastAsia="Times New Roman" w:hAnsi="Times New Roman" w:cs="Times New Roman"/>
+          <w:highlight w:val="yellow"/>
+        </w:rPr>
+        <w:t>[</w:t>
+      </w:r>
+      <w:r>
+        <w:rPr>
+          <w:rFonts w:ascii="Times New Roman" w:eastAsia="Times New Roman" w:hAnsi="Times New Roman" w:cs="Times New Roman"/>
+          <w:i/>
+          <w:iCs/>
+          <w:highlight w:val="yellow"/>
+        </w:rPr>
+        <w:t xml:space="preserve">descrever </w:t>
+      </w:r>
+      <w:r>
+        <w:rPr>
+          <w:rFonts w:ascii="Times New Roman" w:eastAsia="Times New Roman" w:hAnsi="Times New Roman" w:cs="Times New Roman"/>
+          <w:i/>
+          <w:iCs/>
+          <w:highlight w:val="yellow"/>
+        </w:rPr>
+        <w:t xml:space="preserve">a finalidade de cada ferramenta </w:t>
+      </w:r>
+      <w:r>
+        <w:rPr>
+          <w:rFonts w:ascii="Times New Roman" w:eastAsia="Times New Roman" w:hAnsi="Times New Roman" w:cs="Times New Roman"/>
+          <w:i/>
+          <w:iCs/>
+          <w:highlight w:val="yellow"/>
+        </w:rPr>
+        <w:t>utilizada</w:t>
+      </w:r>
+      <w:r>
+        <w:rPr>
+          <w:rFonts w:ascii="Times New Roman" w:eastAsia="Times New Roman" w:hAnsi="Times New Roman" w:cs="Times New Roman"/>
+          <w:highlight w:val="yellow"/>
+        </w:rPr>
+        <w:t>]</w:t>
+      </w:r>
+    </w:p>
+    <w:p>
+      <w:pPr>
+        <w:tabs>
+          <w:tab w:val="left" w:pos="993"/>
+          <w:tab w:val="left" w:pos="1134"/>
+        </w:tabs>
         <w:spacing w:after="0" w:line="240" w:lineRule="auto"/>
-        <w:jc w:val="both"/>
-        <w:rPr>
-          <w:rFonts w:ascii="Times New Roman" w:eastAsia="Times New Roman" w:hAnsi="Times New Roman" w:cs="Times New Roman"/>
-          <w:color w:val="000000"/>
-        </w:rPr>
-      </w:pPr>
-      <w:r>
-        <w:rPr>
-          <w:rFonts w:ascii="Times New Roman" w:eastAsia="Times New Roman" w:hAnsi="Times New Roman" w:cs="Times New Roman"/>
-          <w:color w:val="000000"/>
-        </w:rPr>
-        <w:lastRenderedPageBreak/>
-        <w:t xml:space="preserve">Estou de acordo com a Política de acesso público e </w:t>
-      </w:r>
-      <w:r>
-        <w:rPr>
-          <w:rFonts w:ascii="Times New Roman" w:eastAsia="Times New Roman" w:hAnsi="Times New Roman" w:cs="Times New Roman"/>
-        </w:rPr>
-        <w:t>direitos</w:t>
-      </w:r>
-      <w:r>
-        <w:rPr>
-          <w:rFonts w:ascii="Times New Roman" w:eastAsia="Times New Roman" w:hAnsi="Times New Roman" w:cs="Times New Roman"/>
-          <w:color w:val="000000"/>
-        </w:rPr>
-        <w:t xml:space="preserve"> autorais adotada pela Revista da ANPEGE, que utiliza a Licença </w:t>
-      </w:r>
-      <w:hyperlink r:id="rId6">
-        <w:r>
-          <w:rPr>
-            <w:rFonts w:ascii="Times New Roman" w:eastAsia="Times New Roman" w:hAnsi="Times New Roman" w:cs="Times New Roman"/>
-            <w:color w:val="0563C1"/>
-            <w:u w:val="single"/>
-          </w:rPr>
-          <w:t>Creative Commons – CC BY 4.0</w:t>
-        </w:r>
-      </w:hyperlink>
-      <w:r>
-        <w:rPr>
-          <w:rFonts w:ascii="Times New Roman" w:eastAsia="Times New Roman" w:hAnsi="Times New Roman" w:cs="Times New Roman"/>
-          <w:color w:val="000000"/>
-        </w:rPr>
-        <w:t>.</w:t>
-      </w:r>
-    </w:p>
-    <w:p>
-      <w:pPr>
-        <w:numPr>
-          <w:ilvl w:val="0"/>
-          <w:numId w:val="2"/>
-        </w:numPr>
-        <w:pBdr>
-          <w:top w:val="nil"/>
-          <w:left w:val="nil"/>
-          <w:bottom w:val="nil"/>
-          <w:right w:val="nil"/>
-          <w:between w:val="nil"/>
-        </w:pBdr>
-        <w:spacing w:after="0" w:line="240" w:lineRule="auto"/>
-        <w:jc w:val="both"/>
-        <w:rPr>
-          <w:rFonts w:ascii="Times New Roman" w:eastAsia="Times New Roman" w:hAnsi="Times New Roman" w:cs="Times New Roman"/>
-          <w:color w:val="000000"/>
-        </w:rPr>
-      </w:pPr>
-      <w:r>
-        <w:rPr>
-          <w:rFonts w:ascii="Times New Roman" w:eastAsia="Times New Roman" w:hAnsi="Times New Roman" w:cs="Times New Roman"/>
-          <w:color w:val="000000"/>
-        </w:rPr>
-        <w:t>Certifico que participei da concepção do trabalho</w:t>
-      </w:r>
-      <w:r>
-        <w:rPr>
-          <w:rFonts w:ascii="Times New Roman" w:eastAsia="Times New Roman" w:hAnsi="Times New Roman" w:cs="Times New Roman"/>
-          <w:color w:val="000000"/>
-        </w:rPr>
-        <w:t>,</w:t>
-      </w:r>
-      <w:r>
-        <w:rPr>
-          <w:rFonts w:ascii="Times New Roman" w:eastAsia="Times New Roman" w:hAnsi="Times New Roman" w:cs="Times New Roman"/>
-          <w:color w:val="000000"/>
-        </w:rPr>
-        <w:t xml:space="preserve"> para tornar pública minha responsabilidade pelo seu conteúdo</w:t>
-      </w:r>
-      <w:r>
-        <w:rPr>
-          <w:rFonts w:ascii="Times New Roman" w:eastAsia="Times New Roman" w:hAnsi="Times New Roman" w:cs="Times New Roman"/>
-          <w:color w:val="000000"/>
-        </w:rPr>
-        <w:t>,</w:t>
-      </w:r>
-      <w:r>
-        <w:rPr>
-          <w:rFonts w:ascii="Times New Roman" w:eastAsia="Times New Roman" w:hAnsi="Times New Roman" w:cs="Times New Roman"/>
-          <w:color w:val="000000"/>
-        </w:rPr>
-        <w:t xml:space="preserve"> e que não omiti quaisquer ligações ou acordos de financiamento entre os autores e companhias que possam ter interesse na publicação deste artigo. Todas as pessoas que colaboraram com este estudo, mas que não </w:t>
-      </w:r>
-      <w:r>
-        <w:rPr>
-          <w:rFonts w:ascii="Times New Roman" w:eastAsia="Times New Roman" w:hAnsi="Times New Roman" w:cs="Times New Roman"/>
-          <w:color w:val="000000"/>
-        </w:rPr>
-        <w:t>atendem aos</w:t>
-      </w:r>
-      <w:r>
-        <w:rPr>
-          <w:rFonts w:ascii="Times New Roman" w:eastAsia="Times New Roman" w:hAnsi="Times New Roman" w:cs="Times New Roman"/>
-          <w:color w:val="000000"/>
-        </w:rPr>
-        <w:t xml:space="preserve"> critérios para </w:t>
-      </w:r>
-      <w:r>
-        <w:rPr>
-          <w:rFonts w:ascii="Times New Roman" w:eastAsia="Times New Roman" w:hAnsi="Times New Roman" w:cs="Times New Roman"/>
-          <w:color w:val="000000"/>
-        </w:rPr>
-        <w:t xml:space="preserve">a </w:t>
-      </w:r>
-      <w:r>
-        <w:rPr>
-          <w:rFonts w:ascii="Times New Roman" w:eastAsia="Times New Roman" w:hAnsi="Times New Roman" w:cs="Times New Roman"/>
-          <w:color w:val="000000"/>
-        </w:rPr>
-        <w:t xml:space="preserve">atribuição de autoria, receberam os devidos créditos na nota de agradecimento, </w:t>
-      </w:r>
-      <w:r>
-        <w:rPr>
-          <w:rFonts w:ascii="Times New Roman" w:eastAsia="Times New Roman" w:hAnsi="Times New Roman" w:cs="Times New Roman"/>
-          <w:color w:val="000000"/>
-        </w:rPr>
-        <w:t>medi</w:t>
-      </w:r>
-      <w:r>
-        <w:rPr>
-          <w:rFonts w:ascii="Times New Roman" w:eastAsia="Times New Roman" w:hAnsi="Times New Roman" w:cs="Times New Roman"/>
-          <w:color w:val="000000"/>
-        </w:rPr>
-        <w:t>ante permissão por escrito dos autores referidos.</w:t>
-      </w:r>
-    </w:p>
-    <w:p>
-      <w:pPr>
-        <w:numPr>
-          <w:ilvl w:val="0"/>
-          <w:numId w:val="2"/>
-        </w:numPr>
-        <w:pBdr>
-          <w:top w:val="nil"/>
-          <w:left w:val="nil"/>
-          <w:bottom w:val="nil"/>
-          <w:right w:val="nil"/>
-          <w:between w:val="nil"/>
-        </w:pBdr>
-        <w:spacing w:after="0" w:line="240" w:lineRule="auto"/>
-        <w:jc w:val="both"/>
-        <w:rPr>
-          <w:rFonts w:ascii="Times New Roman" w:eastAsia="Times New Roman" w:hAnsi="Times New Roman" w:cs="Times New Roman"/>
-          <w:color w:val="000000"/>
-        </w:rPr>
-      </w:pPr>
-      <w:r>
-        <w:rPr>
-          <w:rFonts w:ascii="Times New Roman" w:eastAsia="Times New Roman" w:hAnsi="Times New Roman" w:cs="Times New Roman"/>
-          <w:color w:val="000000"/>
-        </w:rPr>
-        <w:t>Declaro que foram respeitados os princípios éticos de pesquisa com seres humanos e/ou animais, em conformidade com as normas vigentes, a saber, as resoluções 466/2012 e 510/2016 do Conselho Nacional de Saúde do Brasil. Todos os documentos relativos à aprovação de um Comitê de Ética (institucional, regional ou nacional) foram enviados junto ao manuscrito</w:t>
-      </w:r>
-      <w:r>
-        <w:rPr>
-          <w:rFonts w:ascii="Times New Roman" w:eastAsia="Times New Roman" w:hAnsi="Times New Roman" w:cs="Times New Roman"/>
-          <w:color w:val="000000"/>
-        </w:rPr>
-        <w:t>,</w:t>
-      </w:r>
-      <w:r>
-        <w:rPr>
-          <w:rFonts w:ascii="Times New Roman" w:eastAsia="Times New Roman" w:hAnsi="Times New Roman" w:cs="Times New Roman"/>
-          <w:color w:val="000000"/>
-        </w:rPr>
-        <w:t xml:space="preserve"> e consta</w:t>
-      </w:r>
-      <w:r>
-        <w:rPr>
-          <w:rFonts w:ascii="Times New Roman" w:eastAsia="Times New Roman" w:hAnsi="Times New Roman" w:cs="Times New Roman"/>
-          <w:color w:val="000000"/>
-        </w:rPr>
-        <w:t xml:space="preserve"> uma</w:t>
-      </w:r>
-      <w:r>
-        <w:rPr>
-          <w:rFonts w:ascii="Times New Roman" w:eastAsia="Times New Roman" w:hAnsi="Times New Roman" w:cs="Times New Roman"/>
-          <w:color w:val="000000"/>
-        </w:rPr>
-        <w:t xml:space="preserve"> clara afirmação de</w:t>
-      </w:r>
-      <w:r>
-        <w:rPr>
-          <w:rFonts w:ascii="Times New Roman" w:eastAsia="Times New Roman" w:hAnsi="Times New Roman" w:cs="Times New Roman"/>
-          <w:color w:val="000000"/>
-        </w:rPr>
-        <w:t xml:space="preserve"> seu</w:t>
-      </w:r>
-      <w:r>
-        <w:rPr>
-          <w:rFonts w:ascii="Times New Roman" w:eastAsia="Times New Roman" w:hAnsi="Times New Roman" w:cs="Times New Roman"/>
-          <w:color w:val="000000"/>
-        </w:rPr>
-        <w:t xml:space="preserve"> cumprimento na seção “Método”.</w:t>
-      </w:r>
-    </w:p>
-    <w:p>
-      <w:pPr>
-        <w:numPr>
-          <w:ilvl w:val="0"/>
-          <w:numId w:val="2"/>
-        </w:numPr>
-        <w:pBdr>
-          <w:top w:val="nil"/>
-          <w:left w:val="nil"/>
-          <w:bottom w:val="nil"/>
-          <w:right w:val="nil"/>
-          <w:between w:val="nil"/>
-        </w:pBdr>
-        <w:spacing w:after="0" w:line="240" w:lineRule="auto"/>
-        <w:jc w:val="both"/>
-        <w:rPr>
-          <w:rFonts w:ascii="Times New Roman" w:eastAsia="Times New Roman" w:hAnsi="Times New Roman" w:cs="Times New Roman"/>
-          <w:color w:val="000000"/>
-        </w:rPr>
-      </w:pPr>
-      <w:r>
-        <w:rPr>
-          <w:rFonts w:ascii="Times New Roman" w:eastAsia="Times New Roman" w:hAnsi="Times New Roman" w:cs="Times New Roman"/>
-          <w:color w:val="000000"/>
-        </w:rPr>
-        <w:t xml:space="preserve">Declaro que não há conflitos de interesse </w:t>
-      </w:r>
-      <w:r>
-        <w:rPr>
-          <w:rFonts w:ascii="Times New Roman" w:eastAsia="Times New Roman" w:hAnsi="Times New Roman" w:cs="Times New Roman"/>
-          <w:color w:val="000000"/>
-        </w:rPr>
-        <w:t>potenciais</w:t>
-      </w:r>
-      <w:r>
-        <w:rPr>
-          <w:rFonts w:ascii="Times New Roman" w:eastAsia="Times New Roman" w:hAnsi="Times New Roman" w:cs="Times New Roman"/>
-          <w:color w:val="000000"/>
-        </w:rPr>
-        <w:t xml:space="preserve"> que possam influenciar o processo de publicação e que o suporte financeiro recebido pela pesquisa foi reconhecido.</w:t>
+        <w:ind w:firstLine="709"/>
+        <w:rPr>
+          <w:rFonts w:ascii="Times New Roman" w:eastAsia="Times New Roman" w:hAnsi="Times New Roman" w:cs="Times New Roman"/>
+        </w:rPr>
+      </w:pPr>
+      <w:r>
+        <w:rPr>
+          <w:rFonts w:ascii="Times New Roman" w:eastAsia="Times New Roman" w:hAnsi="Times New Roman" w:cs="Times New Roman"/>
+        </w:rPr>
+        <w:t>Trecho(s)/etapa(s) em que foi utilizada:</w:t>
+      </w:r>
+      <w:r>
+        <w:rPr>
+          <w:rFonts w:ascii="Times New Roman" w:eastAsia="Times New Roman" w:hAnsi="Times New Roman" w:cs="Times New Roman"/>
+        </w:rPr>
+        <w:t xml:space="preserve"> </w:t>
+      </w:r>
+      <w:r>
+        <w:rPr>
+          <w:rFonts w:ascii="Times New Roman" w:eastAsia="Times New Roman" w:hAnsi="Times New Roman" w:cs="Times New Roman"/>
+          <w:highlight w:val="yellow"/>
+        </w:rPr>
+        <w:t>[</w:t>
+      </w:r>
+      <w:r>
+        <w:rPr>
+          <w:rFonts w:ascii="Times New Roman" w:eastAsia="Times New Roman" w:hAnsi="Times New Roman" w:cs="Times New Roman"/>
+          <w:i/>
+          <w:iCs/>
+          <w:highlight w:val="yellow"/>
+        </w:rPr>
+        <w:t xml:space="preserve">descrever </w:t>
+      </w:r>
+      <w:r>
+        <w:rPr>
+          <w:rFonts w:ascii="Times New Roman" w:eastAsia="Times New Roman" w:hAnsi="Times New Roman" w:cs="Times New Roman"/>
+          <w:i/>
+          <w:iCs/>
+          <w:highlight w:val="yellow"/>
+        </w:rPr>
+        <w:t xml:space="preserve">as etapas em que </w:t>
+      </w:r>
+      <w:r>
+        <w:rPr>
+          <w:rFonts w:ascii="Times New Roman" w:eastAsia="Times New Roman" w:hAnsi="Times New Roman" w:cs="Times New Roman"/>
+          <w:i/>
+          <w:iCs/>
+          <w:highlight w:val="yellow"/>
+        </w:rPr>
+        <w:t>cada ferramenta</w:t>
+      </w:r>
+      <w:r>
+        <w:rPr>
+          <w:rFonts w:ascii="Times New Roman" w:eastAsia="Times New Roman" w:hAnsi="Times New Roman" w:cs="Times New Roman"/>
+          <w:i/>
+          <w:iCs/>
+          <w:highlight w:val="yellow"/>
+        </w:rPr>
+        <w:t xml:space="preserve"> foi</w:t>
+      </w:r>
+      <w:r>
+        <w:rPr>
+          <w:rFonts w:ascii="Times New Roman" w:eastAsia="Times New Roman" w:hAnsi="Times New Roman" w:cs="Times New Roman"/>
+          <w:i/>
+          <w:iCs/>
+          <w:highlight w:val="yellow"/>
+        </w:rPr>
+        <w:t xml:space="preserve"> utilizada</w:t>
+      </w:r>
+      <w:r>
+        <w:rPr>
+          <w:rFonts w:ascii="Times New Roman" w:eastAsia="Times New Roman" w:hAnsi="Times New Roman" w:cs="Times New Roman"/>
+          <w:highlight w:val="yellow"/>
+        </w:rPr>
+        <w:t>]</w:t>
       </w:r>
     </w:p>
     <w:p>
@@ -1201,6 +1831,7 @@
       <w:r>
         <w:rPr>
           <w:rFonts w:ascii="Times New Roman" w:eastAsia="Times New Roman" w:hAnsi="Times New Roman" w:cs="Times New Roman"/>
+          <w:highlight w:val="yellow"/>
         </w:rPr>
         <w:t>[</w:t>
       </w:r>
@@ -1216,9 +1847,19 @@
       <w:r>
         <w:rPr>
           <w:rFonts w:ascii="Times New Roman" w:eastAsia="Times New Roman" w:hAnsi="Times New Roman" w:cs="Times New Roman"/>
+          <w:highlight w:val="yellow"/>
         </w:rPr>
         <w:t>]</w:t>
       </w:r>
+    </w:p>
+    <w:p>
+      <w:pPr>
+        <w:spacing w:after="0" w:line="240" w:lineRule="auto"/>
+        <w:jc w:val="right"/>
+        <w:rPr>
+          <w:rFonts w:ascii="Times New Roman" w:eastAsia="Times New Roman" w:hAnsi="Times New Roman" w:cs="Times New Roman"/>
+        </w:rPr>
+      </w:pPr>
     </w:p>
     <w:p>
       <w:pPr>
@@ -1231,6 +1872,7 @@
         </w:rPr>
       </w:pPr>
       <w:commentRangeStart w:id="1"/>
+      <w:commentRangeStart w:id="2"/>
     </w:p>
     <w:p>
       <w:pPr>
@@ -1240,6 +1882,7 @@
           <w:rFonts w:ascii="Times New Roman" w:eastAsia="Times New Roman" w:hAnsi="Times New Roman" w:cs="Times New Roman"/>
           <w:sz w:val="20"/>
           <w:szCs w:val="20"/>
+          <w:highlight w:val="yellow"/>
         </w:rPr>
       </w:pPr>
       <w:r>
@@ -1247,6 +1890,7 @@
           <w:rFonts w:ascii="Times New Roman" w:eastAsia="Times New Roman" w:hAnsi="Times New Roman" w:cs="Times New Roman"/>
           <w:sz w:val="20"/>
           <w:szCs w:val="20"/>
+          <w:highlight w:val="yellow"/>
         </w:rPr>
         <w:t>[</w:t>
       </w:r>
@@ -1264,8 +1908,20 @@
       <w:r>
         <w:rPr>
           <w:rFonts w:ascii="Times New Roman" w:eastAsia="Times New Roman" w:hAnsi="Times New Roman" w:cs="Times New Roman"/>
+          <w:i/>
+          <w:iCs/>
           <w:sz w:val="20"/>
           <w:szCs w:val="20"/>
+          <w:highlight w:val="yellow"/>
+        </w:rPr>
+        <w:t xml:space="preserve"> digital pessoa autora correspondente, preferencialmente pelo govbr</w:t>
+      </w:r>
+      <w:r>
+        <w:rPr>
+          <w:rFonts w:ascii="Times New Roman" w:eastAsia="Times New Roman" w:hAnsi="Times New Roman" w:cs="Times New Roman"/>
+          <w:sz w:val="20"/>
+          <w:szCs w:val="20"/>
+          <w:highlight w:val="yellow"/>
         </w:rPr>
         <w:t>]</w:t>
       </w:r>
@@ -1293,6 +1949,7 @@
           <w:rFonts w:ascii="Times New Roman" w:eastAsia="Times New Roman" w:hAnsi="Times New Roman" w:cs="Times New Roman"/>
           <w:sz w:val="20"/>
           <w:szCs w:val="20"/>
+          <w:highlight w:val="yellow"/>
         </w:rPr>
       </w:pPr>
       <w:r>
@@ -1300,6 +1957,7 @@
           <w:rFonts w:ascii="Times New Roman" w:eastAsia="Times New Roman" w:hAnsi="Times New Roman" w:cs="Times New Roman"/>
           <w:sz w:val="20"/>
           <w:szCs w:val="20"/>
+          <w:highlight w:val="yellow"/>
         </w:rPr>
         <w:t>[</w:t>
       </w:r>
@@ -1319,6 +1977,7 @@
           <w:rFonts w:ascii="Times New Roman" w:eastAsia="Times New Roman" w:hAnsi="Times New Roman" w:cs="Times New Roman"/>
           <w:sz w:val="20"/>
           <w:szCs w:val="20"/>
+          <w:highlight w:val="yellow"/>
         </w:rPr>
         <w:t>]</w:t>
       </w:r>
@@ -1331,6 +1990,7 @@
           <w:rFonts w:ascii="Times New Roman" w:eastAsia="Times New Roman" w:hAnsi="Times New Roman" w:cs="Times New Roman"/>
           <w:sz w:val="20"/>
           <w:szCs w:val="20"/>
+          <w:highlight w:val="yellow"/>
         </w:rPr>
       </w:pPr>
       <w:r>
@@ -1338,6 +1998,7 @@
           <w:rFonts w:ascii="Times New Roman" w:eastAsia="Times New Roman" w:hAnsi="Times New Roman" w:cs="Times New Roman"/>
           <w:sz w:val="20"/>
           <w:szCs w:val="20"/>
+          <w:highlight w:val="yellow"/>
         </w:rPr>
         <w:t>[</w:t>
       </w:r>
@@ -1357,6 +2018,7 @@
           <w:rFonts w:ascii="Times New Roman" w:eastAsia="Times New Roman" w:hAnsi="Times New Roman" w:cs="Times New Roman"/>
           <w:sz w:val="20"/>
           <w:szCs w:val="20"/>
+          <w:highlight w:val="yellow"/>
         </w:rPr>
         <w:t>]</w:t>
       </w:r>
@@ -1376,6 +2038,7 @@
           <w:rFonts w:ascii="Times New Roman" w:eastAsia="Times New Roman" w:hAnsi="Times New Roman" w:cs="Times New Roman"/>
           <w:sz w:val="20"/>
           <w:szCs w:val="20"/>
+          <w:highlight w:val="yellow"/>
         </w:rPr>
         <w:t>[</w:t>
       </w:r>
@@ -1395,6 +2058,7 @@
           <w:rFonts w:ascii="Times New Roman" w:eastAsia="Times New Roman" w:hAnsi="Times New Roman" w:cs="Times New Roman"/>
           <w:sz w:val="20"/>
           <w:szCs w:val="20"/>
+          <w:highlight w:val="yellow"/>
         </w:rPr>
         <w:t>]</w:t>
       </w:r>
@@ -1408,6 +2072,36 @@
         </w:rPr>
         <w:commentReference w:id="1"/>
       </w:r>
+      <w:commentRangeEnd w:id="2"/>
+      <w:r>
+        <w:rPr>
+          <w:rStyle w:val="Refdecomentrio"/>
+          <w:rFonts w:ascii="Times New Roman" w:eastAsia="Times New Roman" w:hAnsi="Times New Roman" w:cs="Times New Roman"/>
+          <w:sz w:val="20"/>
+          <w:szCs w:val="20"/>
+        </w:rPr>
+        <w:commentReference w:id="2"/>
+      </w:r>
+    </w:p>
+    <w:p>
+      <w:pPr>
+        <w:spacing w:after="0" w:line="240" w:lineRule="auto"/>
+        <w:rPr>
+          <w:rFonts w:ascii="Times New Roman" w:eastAsia="Times New Roman" w:hAnsi="Times New Roman" w:cs="Times New Roman"/>
+          <w:sz w:val="20"/>
+          <w:szCs w:val="20"/>
+        </w:rPr>
+      </w:pPr>
+    </w:p>
+    <w:p>
+      <w:pPr>
+        <w:spacing w:after="0" w:line="240" w:lineRule="auto"/>
+        <w:rPr>
+          <w:rFonts w:ascii="Times New Roman" w:eastAsia="Times New Roman" w:hAnsi="Times New Roman" w:cs="Times New Roman"/>
+          <w:sz w:val="20"/>
+          <w:szCs w:val="20"/>
+        </w:rPr>
+      </w:pPr>
     </w:p>
     <w:p>
       <w:pPr>
@@ -1448,30 +2142,71 @@
       </w:r>
     </w:p>
   </w:comment>
+  <w:comment w:id="2" w:author="Avaliadora -" w:date="2026-04-04T17:58:00Z" w:initials="A-">
+    <w:p>
+      <w:r>
+        <w:rPr>
+          <w:rStyle w:val="Refdecomentrio"/>
+        </w:rPr>
+        <w:annotationRef/>
+      </w:r>
+      <w:r>
+        <w:rPr>
+          <w:sz w:val="20"/>
+          <w:szCs w:val="20"/>
+        </w:rPr>
+        <w:t>Replicar para demais pessoas autoras</w:t>
+      </w:r>
+    </w:p>
+  </w:comment>
 </w:comments>
 </file>
 
 <file path=word/commentsExtended.xml><?xml version="1.0" encoding="utf-8"?>
 <w15:commentsEx xmlns:wpc="http://schemas.microsoft.com/office/word/2010/wordprocessingCanvas" xmlns:cx="http://schemas.microsoft.com/office/drawing/2014/chartex" xmlns:cx1="http://schemas.microsoft.com/office/drawing/2015/9/8/chartex" xmlns:cx2="http://schemas.microsoft.com/office/drawing/2015/10/21/chartex" xmlns:cx3="http://schemas.microsoft.com/office/drawing/2016/5/9/chartex" xmlns:cx4="http://schemas.microsoft.com/office/drawing/2016/5/10/chartex" xmlns:cx5="http://schemas.microsoft.com/office/drawing/2016/5/11/chartex" xmlns:cx6="http://schemas.microsoft.com/office/drawing/2016/5/12/chartex" xmlns:cx7="http://schemas.microsoft.com/office/drawing/2016/5/13/chartex" xmlns:cx8="http://schemas.microsoft.com/office/drawing/2016/5/14/chartex" xmlns:mc="http://schemas.openxmlformats.org/markup-compatibility/2006" xmlns:aink="http://schemas.microsoft.com/office/drawing/2016/ink" xmlns:am3d="http://schemas.microsoft.com/office/drawing/2017/model3d" xmlns:o="urn:schemas-microsoft-com:office:office" xmlns:oel="http://schemas.microsoft.com/office/2019/extlst" xmlns:r="http://schemas.openxmlformats.org/officeDocument/2006/relationships" xmlns:m="http://schemas.openxmlformats.org/officeDocument/2006/math" xmlns:v="urn:schemas-microsoft-com:vml" xmlns:wp14="http://schemas.microsoft.com/office/word/2010/wordprocessingDrawing" xmlns:wp="http://schemas.openxmlformats.org/drawingml/2006/wordprocessingDrawing" xmlns:w10="urn:schemas-microsoft-com:office:word" xmlns:w="http://schemas.openxmlformats.org/wordprocessingml/2006/main" xmlns:w14="http://schemas.microsoft.com/office/word/2010/wordml" xmlns:w15="http://schemas.microsoft.com/office/word/2012/wordml" xmlns:w16cex="http://schemas.microsoft.com/office/word/2018/wordml/cex" xmlns:w16cid="http://schemas.microsoft.com/office/word/2016/wordml/cid" xmlns:w16="http://schemas.microsoft.com/office/word/2018/wordml" xmlns:w16du="http://schemas.microsoft.com/office/word/2023/wordml/word16du" xmlns:w16sdtdh="http://schemas.microsoft.com/office/word/2020/wordml/sdtdatahash" xmlns:w16sdtfl="http://schemas.microsoft.com/office/word/2024/wordml/sdtformatlock" xmlns:w16se="http://schemas.microsoft.com/office/word/2015/wordml/symex" xmlns:wpg="http://schemas.microsoft.com/office/word/2010/wordprocessingGroup" xmlns:wpi="http://schemas.microsoft.com/office/word/2010/wordprocessingInk" xmlns:wne="http://schemas.microsoft.com/office/word/2006/wordml" xmlns:wps="http://schemas.microsoft.com/office/word/2010/wordprocessingShape" mc:Ignorable="w14 w15 w16se w16cid w16 w16cex w16sdtdh w16sdtfl w16du wp14">
   <w15:commentEx w15:paraId="6B821D5A" w15:done="0"/>
+  <w15:commentEx w15:paraId="4B5A6161" w15:paraIdParent="6B821D5A" w15:done="0"/>
 </w15:commentsEx>
 </file>
 
 <file path=word/commentsExtensible.xml><?xml version="1.0" encoding="utf-8"?>
 <w16cex:commentsExtensible xmlns:wpc="http://schemas.microsoft.com/office/word/2010/wordprocessingCanvas" xmlns:cx="http://schemas.microsoft.com/office/drawing/2014/chartex" xmlns:cx1="http://schemas.microsoft.com/office/drawing/2015/9/8/chartex" xmlns:cx2="http://schemas.microsoft.com/office/drawing/2015/10/21/chartex" xmlns:cx3="http://schemas.microsoft.com/office/drawing/2016/5/9/chartex" xmlns:cx4="http://schemas.microsoft.com/office/drawing/2016/5/10/chartex" xmlns:cx5="http://schemas.microsoft.com/office/drawing/2016/5/11/chartex" xmlns:cx6="http://schemas.microsoft.com/office/drawing/2016/5/12/chartex" xmlns:cx7="http://schemas.microsoft.com/office/drawing/2016/5/13/chartex" xmlns:cx8="http://schemas.microsoft.com/office/drawing/2016/5/14/chartex" xmlns:cr="http://schemas.microsoft.com/office/comments/2020/reactions" xmlns:mc="http://schemas.openxmlformats.org/markup-compatibility/2006" xmlns:aink="http://schemas.microsoft.com/office/drawing/2016/ink" xmlns:am3d="http://schemas.microsoft.com/office/drawing/2017/model3d" xmlns:o="urn:schemas-microsoft-com:office:office" xmlns:oel="http://schemas.microsoft.com/office/2019/extlst" xmlns:r="http://schemas.openxmlformats.org/officeDocument/2006/relationships" xmlns:m="http://schemas.openxmlformats.org/officeDocument/2006/math" xmlns:v="urn:schemas-microsoft-com:vml" xmlns:wp14="http://schemas.microsoft.com/office/word/2010/wordprocessingDrawing" xmlns:wp="http://schemas.openxmlformats.org/drawingml/2006/wordprocessingDrawing" xmlns:w10="urn:schemas-microsoft-com:office:word" xmlns:w="http://schemas.openxmlformats.org/wordprocessingml/2006/main" xmlns:w14="http://schemas.microsoft.com/office/word/2010/wordml" xmlns:w15="http://schemas.microsoft.com/office/word/2012/wordml" xmlns:w16cex="http://schemas.microsoft.com/office/word/2018/wordml/cex" xmlns:w16cid="http://schemas.microsoft.com/office/word/2016/wordml/cid" xmlns:w16="http://schemas.microsoft.com/office/word/2018/wordml" xmlns:w16du="http://schemas.microsoft.com/office/word/2023/wordml/word16du" xmlns:w16sdtdh="http://schemas.microsoft.com/office/word/2020/wordml/sdtdatahash" xmlns:w16sdtfl="http://schemas.microsoft.com/office/word/2024/wordml/sdtformatlock" xmlns:w16se="http://schemas.microsoft.com/office/word/2015/wordml/symex" xmlns:wpg="http://schemas.microsoft.com/office/word/2010/wordprocessingGroup" xmlns:wpi="http://schemas.microsoft.com/office/word/2010/wordprocessingInk" xmlns:wne="http://schemas.microsoft.com/office/word/2006/wordml" xmlns:wps="http://schemas.microsoft.com/office/word/2010/wordprocessingShape" mc:Ignorable="w14 w15 w16se w16cid w16 w16cex w16sdtdh w16sdtfl cr w16du wp14">
   <w16cex:commentExtensible w16cex:durableId="715E0600" w16cex:dateUtc="2026-04-04T21:22:00Z"/>
+  <w16cex:commentExtensible w16cex:durableId="2B29D1D2" w16cex:dateUtc="2026-04-04T21:58:00Z"/>
 </w16cex:commentsExtensible>
 </file>
 
 <file path=word/commentsIds.xml><?xml version="1.0" encoding="utf-8"?>
 <w16cid:commentsIds xmlns:wpc="http://schemas.microsoft.com/office/word/2010/wordprocessingCanvas" xmlns:cx="http://schemas.microsoft.com/office/drawing/2014/chartex" xmlns:cx1="http://schemas.microsoft.com/office/drawing/2015/9/8/chartex" xmlns:cx2="http://schemas.microsoft.com/office/drawing/2015/10/21/chartex" xmlns:cx3="http://schemas.microsoft.com/office/drawing/2016/5/9/chartex" xmlns:cx4="http://schemas.microsoft.com/office/drawing/2016/5/10/chartex" xmlns:cx5="http://schemas.microsoft.com/office/drawing/2016/5/11/chartex" xmlns:cx6="http://schemas.microsoft.com/office/drawing/2016/5/12/chartex" xmlns:cx7="http://schemas.microsoft.com/office/drawing/2016/5/13/chartex" xmlns:cx8="http://schemas.microsoft.com/office/drawing/2016/5/14/chartex" xmlns:mc="http://schemas.openxmlformats.org/markup-compatibility/2006" xmlns:aink="http://schemas.microsoft.com/office/drawing/2016/ink" xmlns:am3d="http://schemas.microsoft.com/office/drawing/2017/model3d" xmlns:o="urn:schemas-microsoft-com:office:office" xmlns:oel="http://schemas.microsoft.com/office/2019/extlst" xmlns:r="http://schemas.openxmlformats.org/officeDocument/2006/relationships" xmlns:m="http://schemas.openxmlformats.org/officeDocument/2006/math" xmlns:v="urn:schemas-microsoft-com:vml" xmlns:wp14="http://schemas.microsoft.com/office/word/2010/wordprocessingDrawing" xmlns:wp="http://schemas.openxmlformats.org/drawingml/2006/wordprocessingDrawing" xmlns:w10="urn:schemas-microsoft-com:office:word" xmlns:w="http://schemas.openxmlformats.org/wordprocessingml/2006/main" xmlns:w14="http://schemas.microsoft.com/office/word/2010/wordml" xmlns:w15="http://schemas.microsoft.com/office/word/2012/wordml" xmlns:w16cex="http://schemas.microsoft.com/office/word/2018/wordml/cex" xmlns:w16cid="http://schemas.microsoft.com/office/word/2016/wordml/cid" xmlns:w16="http://schemas.microsoft.com/office/word/2018/wordml" xmlns:w16du="http://schemas.microsoft.com/office/word/2023/wordml/word16du" xmlns:w16sdtdh="http://schemas.microsoft.com/office/word/2020/wordml/sdtdatahash" xmlns:w16sdtfl="http://schemas.microsoft.com/office/word/2024/wordml/sdtformatlock" xmlns:w16se="http://schemas.microsoft.com/office/word/2015/wordml/symex" xmlns:wpg="http://schemas.microsoft.com/office/word/2010/wordprocessingGroup" xmlns:wpi="http://schemas.microsoft.com/office/word/2010/wordprocessingInk" xmlns:wne="http://schemas.microsoft.com/office/word/2006/wordml" xmlns:wps="http://schemas.microsoft.com/office/word/2010/wordprocessingShape" mc:Ignorable="w14 w15 w16se w16cid w16 w16cex w16sdtdh w16sdtfl w16du wp14">
   <w16cid:commentId w16cid:paraId="6B821D5A" w16cid:durableId="715E0600"/>
+  <w16cid:commentId w16cid:paraId="4B5A6161" w16cid:durableId="2B29D1D2"/>
 </w16cid:commentsIds>
 </file>
 
 <file path=word/numbering.xml><?xml version="1.0" encoding="utf-8"?>
 <w:numbering xmlns:wpc="http://schemas.microsoft.com/office/word/2010/wordprocessingCanvas" xmlns:cx="http://schemas.microsoft.com/office/drawing/2014/chartex" xmlns:cx1="http://schemas.microsoft.com/office/drawing/2015/9/8/chartex" xmlns:cx2="http://schemas.microsoft.com/office/drawing/2015/10/21/chartex" xmlns:cx3="http://schemas.microsoft.com/office/drawing/2016/5/9/chartex" xmlns:cx4="http://schemas.microsoft.com/office/drawing/2016/5/10/chartex" xmlns:cx5="http://schemas.microsoft.com/office/drawing/2016/5/11/chartex" xmlns:cx6="http://schemas.microsoft.com/office/drawing/2016/5/12/chartex" xmlns:cx7="http://schemas.microsoft.com/office/drawing/2016/5/13/chartex" xmlns:cx8="http://schemas.microsoft.com/office/drawing/2016/5/14/chartex" xmlns:mc="http://schemas.openxmlformats.org/markup-compatibility/2006" xmlns:aink="http://schemas.microsoft.com/office/drawing/2016/ink" xmlns:am3d="http://schemas.microsoft.com/office/drawing/2017/model3d" xmlns:o="urn:schemas-microsoft-com:office:office" xmlns:oel="http://schemas.microsoft.com/office/2019/extlst" xmlns:r="http://schemas.openxmlformats.org/officeDocument/2006/relationships" xmlns:m="http://schemas.openxmlformats.org/officeDocument/2006/math" xmlns:v="urn:schemas-microsoft-com:vml" xmlns:wp14="http://schemas.microsoft.com/office/word/2010/wordprocessingDrawing" xmlns:wp="http://schemas.openxmlformats.org/drawingml/2006/wordprocessingDrawing" xmlns:w10="urn:schemas-microsoft-com:office:word" xmlns:w="http://schemas.openxmlformats.org/wordprocessingml/2006/main" xmlns:w14="http://schemas.microsoft.com/office/word/2010/wordml" xmlns:w15="http://schemas.microsoft.com/office/word/2012/wordml" xmlns:w16cex="http://schemas.microsoft.com/office/word/2018/wordml/cex" xmlns:w16cid="http://schemas.microsoft.com/office/word/2016/wordml/cid" xmlns:w16="http://schemas.microsoft.com/office/word/2018/wordml" xmlns:w16du="http://schemas.microsoft.com/office/word/2023/wordml/word16du" xmlns:w16sdtdh="http://schemas.microsoft.com/office/word/2020/wordml/sdtdatahash" xmlns:w16sdtfl="http://schemas.microsoft.com/office/word/2024/wordml/sdtformatlock" xmlns:w16se="http://schemas.microsoft.com/office/word/2015/wordml/symex" xmlns:wpg="http://schemas.microsoft.com/office/word/2010/wordprocessingGroup" xmlns:wpi="http://schemas.microsoft.com/office/word/2010/wordprocessingInk" xmlns:wne="http://schemas.microsoft.com/office/word/2006/wordml" xmlns:wps="http://schemas.microsoft.com/office/word/2010/wordprocessingShape" mc:Ignorable="w14 w15 w16se w16cid w16 w16cex w16sdtdh w16sdtfl w16du wp14">
   <w:abstractNum w:abstractNumId="0" w15:restartNumberingAfterBreak="0">
+    <w:nsid w:val="FFFFFF89"/>
+    <w:multiLevelType w:val="singleLevel"/>
+    <w:tmpl w:val="6D0864CE"/>
+    <w:lvl w:ilvl="0">
+      <w:start w:val="1"/>
+      <w:numFmt w:val="bullet"/>
+      <w:pStyle w:val="Commarcadores"/>
+      <w:lvlText w:val=""/>
+      <w:lvlJc w:val="left"/>
+      <w:pPr>
+        <w:tabs>
+          <w:tab w:val="num" w:pos="360"/>
+        </w:tabs>
+        <w:ind w:left="360" w:hanging="360"/>
+      </w:pPr>
+      <w:rPr>
+        <w:rFonts w:ascii="Symbol" w:hAnsi="Symbol" w:hint="default"/>
+      </w:rPr>
+    </w:lvl>
+  </w:abstractNum>
+  <w:abstractNum w:abstractNumId="1" w15:restartNumberingAfterBreak="0">
     <w:nsid w:val="12690808"/>
     <w:multiLevelType w:val="hybridMultilevel"/>
     <w:tmpl w:val="9D788986"/>
@@ -1584,7 +2319,7 @@
       </w:rPr>
     </w:lvl>
   </w:abstractNum>
-  <w:abstractNum w:abstractNumId="1" w15:restartNumberingAfterBreak="0">
+  <w:abstractNum w:abstractNumId="2" w15:restartNumberingAfterBreak="0">
     <w:nsid w:val="33C843F6"/>
     <w:multiLevelType w:val="multilevel"/>
     <w:tmpl w:val="F3D0FF9E"/>
@@ -1697,7 +2432,7 @@
       </w:rPr>
     </w:lvl>
   </w:abstractNum>
-  <w:abstractNum w:abstractNumId="2" w15:restartNumberingAfterBreak="0">
+  <w:abstractNum w:abstractNumId="3" w15:restartNumberingAfterBreak="0">
     <w:nsid w:val="44327655"/>
     <w:multiLevelType w:val="multilevel"/>
     <w:tmpl w:val="DDAC9A08"/>
@@ -1810,7 +2545,7 @@
       </w:rPr>
     </w:lvl>
   </w:abstractNum>
-  <w:abstractNum w:abstractNumId="3" w15:restartNumberingAfterBreak="0">
+  <w:abstractNum w:abstractNumId="4" w15:restartNumberingAfterBreak="0">
     <w:nsid w:val="46C4225D"/>
     <w:multiLevelType w:val="multilevel"/>
     <w:tmpl w:val="F3D0FF9E"/>
@@ -1923,17 +2658,133 @@
       </w:rPr>
     </w:lvl>
   </w:abstractNum>
+  <w:abstractNum w:abstractNumId="5" w15:restartNumberingAfterBreak="0">
+    <w:nsid w:val="608515D5"/>
+    <w:multiLevelType w:val="multilevel"/>
+    <w:tmpl w:val="EE828FEA"/>
+    <w:lvl w:ilvl="0">
+      <w:start w:val="1"/>
+      <w:numFmt w:val="decimal"/>
+      <w:lvlText w:val="%1."/>
+      <w:lvlJc w:val="left"/>
+      <w:pPr>
+        <w:ind w:left="1068" w:hanging="360"/>
+      </w:pPr>
+    </w:lvl>
+    <w:lvl w:ilvl="1">
+      <w:start w:val="1"/>
+      <w:numFmt w:val="bullet"/>
+      <w:lvlText w:val="o"/>
+      <w:lvlJc w:val="left"/>
+      <w:pPr>
+        <w:ind w:left="1788" w:hanging="360"/>
+      </w:pPr>
+      <w:rPr>
+        <w:rFonts w:ascii="Courier New" w:eastAsia="Courier New" w:hAnsi="Courier New" w:cs="Courier New"/>
+      </w:rPr>
+    </w:lvl>
+    <w:lvl w:ilvl="2">
+      <w:start w:val="1"/>
+      <w:numFmt w:val="bullet"/>
+      <w:lvlText w:val="▪"/>
+      <w:lvlJc w:val="left"/>
+      <w:pPr>
+        <w:ind w:left="2508" w:hanging="360"/>
+      </w:pPr>
+      <w:rPr>
+        <w:rFonts w:ascii="Noto Sans Symbols" w:eastAsia="Noto Sans Symbols" w:hAnsi="Noto Sans Symbols" w:cs="Noto Sans Symbols"/>
+      </w:rPr>
+    </w:lvl>
+    <w:lvl w:ilvl="3">
+      <w:start w:val="1"/>
+      <w:numFmt w:val="bullet"/>
+      <w:lvlText w:val="●"/>
+      <w:lvlJc w:val="left"/>
+      <w:pPr>
+        <w:ind w:left="3228" w:hanging="360"/>
+      </w:pPr>
+      <w:rPr>
+        <w:rFonts w:ascii="Noto Sans Symbols" w:eastAsia="Noto Sans Symbols" w:hAnsi="Noto Sans Symbols" w:cs="Noto Sans Symbols"/>
+      </w:rPr>
+    </w:lvl>
+    <w:lvl w:ilvl="4">
+      <w:start w:val="1"/>
+      <w:numFmt w:val="bullet"/>
+      <w:lvlText w:val="o"/>
+      <w:lvlJc w:val="left"/>
+      <w:pPr>
+        <w:ind w:left="3948" w:hanging="360"/>
+      </w:pPr>
+      <w:rPr>
+        <w:rFonts w:ascii="Courier New" w:eastAsia="Courier New" w:hAnsi="Courier New" w:cs="Courier New"/>
+      </w:rPr>
+    </w:lvl>
+    <w:lvl w:ilvl="5">
+      <w:start w:val="1"/>
+      <w:numFmt w:val="bullet"/>
+      <w:lvlText w:val="▪"/>
+      <w:lvlJc w:val="left"/>
+      <w:pPr>
+        <w:ind w:left="4668" w:hanging="360"/>
+      </w:pPr>
+      <w:rPr>
+        <w:rFonts w:ascii="Noto Sans Symbols" w:eastAsia="Noto Sans Symbols" w:hAnsi="Noto Sans Symbols" w:cs="Noto Sans Symbols"/>
+      </w:rPr>
+    </w:lvl>
+    <w:lvl w:ilvl="6">
+      <w:start w:val="1"/>
+      <w:numFmt w:val="bullet"/>
+      <w:lvlText w:val="●"/>
+      <w:lvlJc w:val="left"/>
+      <w:pPr>
+        <w:ind w:left="5388" w:hanging="360"/>
+      </w:pPr>
+      <w:rPr>
+        <w:rFonts w:ascii="Noto Sans Symbols" w:eastAsia="Noto Sans Symbols" w:hAnsi="Noto Sans Symbols" w:cs="Noto Sans Symbols"/>
+      </w:rPr>
+    </w:lvl>
+    <w:lvl w:ilvl="7">
+      <w:start w:val="1"/>
+      <w:numFmt w:val="bullet"/>
+      <w:lvlText w:val="o"/>
+      <w:lvlJc w:val="left"/>
+      <w:pPr>
+        <w:ind w:left="6108" w:hanging="360"/>
+      </w:pPr>
+      <w:rPr>
+        <w:rFonts w:ascii="Courier New" w:eastAsia="Courier New" w:hAnsi="Courier New" w:cs="Courier New"/>
+      </w:rPr>
+    </w:lvl>
+    <w:lvl w:ilvl="8">
+      <w:start w:val="1"/>
+      <w:numFmt w:val="bullet"/>
+      <w:lvlText w:val="▪"/>
+      <w:lvlJc w:val="left"/>
+      <w:pPr>
+        <w:ind w:left="6828" w:hanging="360"/>
+      </w:pPr>
+      <w:rPr>
+        <w:rFonts w:ascii="Noto Sans Symbols" w:eastAsia="Noto Sans Symbols" w:hAnsi="Noto Sans Symbols" w:cs="Noto Sans Symbols"/>
+      </w:rPr>
+    </w:lvl>
+  </w:abstractNum>
   <w:num w:numId="1" w16cid:durableId="1576819441">
+    <w:abstractNumId w:val="3"/>
+  </w:num>
+  <w:num w:numId="2" w16cid:durableId="1539776779">
+    <w:abstractNumId w:val="4"/>
+  </w:num>
+  <w:num w:numId="3" w16cid:durableId="1890605522">
+    <w:abstractNumId w:val="1"/>
+  </w:num>
+  <w:num w:numId="4" w16cid:durableId="2069571557">
     <w:abstractNumId w:val="2"/>
   </w:num>
-  <w:num w:numId="2" w16cid:durableId="1539776779">
-    <w:abstractNumId w:val="3"/>
+  <w:num w:numId="5" w16cid:durableId="857544270">
+    <w:abstractNumId w:val="5"/>
   </w:num>
-  <w:num w:numId="3" w16cid:durableId="1890605522">
+  <w:num w:numId="6" w16cid:durableId="912273779">
     <w:abstractNumId w:val="0"/>
-  </w:num>
-  <w:num w:numId="4" w16cid:durableId="2069571557">
-    <w:abstractNumId w:val="1"/>
   </w:num>
 </w:numbering>
 </file>
@@ -2654,6 +3505,19 @@
       <w:szCs w:val="20"/>
     </w:rPr>
   </w:style>
+  <w:style w:type="paragraph" w:styleId="Commarcadores">
+    <w:name w:val="List Bullet"/>
+    <w:basedOn w:val="Normal"/>
+    <w:uiPriority w:val="99"/>
+    <w:unhideWhenUsed/>
+    <w:rsid w:val="006B48EB"/>
+    <w:pPr>
+      <w:numPr>
+        <w:numId w:val="6"/>
+      </w:numPr>
+      <w:contextualSpacing/>
+    </w:pPr>
+  </w:style>
 </w:styles>
 </file>
 

</xml_diff>